<commit_message>
Fix grid layout: 5-col desktop responsive, fix booth-container/modal CSS, restore AAP blue, add Raja Sansi Excel+Word reports
</commit_message>
<xml_diff>
--- a/public/Raja_Sansi_Master_Booth_Analysis_AAP.docx
+++ b/public/Raja_Sansi_Master_Booth_Analysis_AAP.docx
@@ -20,9 +20,39 @@
             <w:vAlign w:val="center"/>
           </w:tcPr>
           <w:p>
-            <w:r/>
             <w:r>
-              <w:t>DSIDEIN</w:t>
+              <w:drawing>
+                <wp:inline xmlns:a="http://schemas.openxmlformats.org/drawingml/2006/main" xmlns:pic="http://schemas.openxmlformats.org/drawingml/2006/picture">
+                  <wp:extent cx="868680" cy="1145600"/>
+                  <wp:docPr id="1" name="Picture 1"/>
+                  <wp:cNvGraphicFramePr>
+                    <a:graphicFrameLocks noChangeAspect="1"/>
+                  </wp:cNvGraphicFramePr>
+                  <a:graphic>
+                    <a:graphicData uri="http://schemas.openxmlformats.org/drawingml/2006/picture">
+                      <pic:pic>
+                        <pic:nvPicPr>
+                          <pic:cNvPr id="0" name="dsidein_logo_transparent.png"/>
+                          <pic:cNvPicPr/>
+                        </pic:nvPicPr>
+                        <pic:blipFill>
+                          <a:blip r:embed="rId11"/>
+                          <a:stretch>
+                            <a:fillRect/>
+                          </a:stretch>
+                        </pic:blipFill>
+                        <pic:spPr>
+                          <a:xfrm>
+                            <a:off x="0" y="0"/>
+                            <a:ext cx="868680" cy="1145600"/>
+                          </a:xfrm>
+                          <a:prstGeom prst="rect"/>
+                        </pic:spPr>
+                      </pic:pic>
+                    </a:graphicData>
+                  </a:graphic>
+                </wp:inline>
+              </w:drawing>
             </w:r>
           </w:p>
         </w:tc>
@@ -78,20 +108,7 @@
     </w:p>
     <w:p>
       <w:r>
-        <w:t>In the 2024 Parliamentary elections, the 12-Raja Sansi Assembly segment (Amritsar PC) displayed intense political churn and significant structural shifts compared to the 2022 Vidhan Sabha election. Total voter turnout contracted by 19,426 votes (-14.58%), dropping from 133,259 votes in 2022 to 113,833 votes in 2024. The Indian National Congress (INC) retained the constituency lead in both elections with Gurjeet Singh Aujla securing 36,285 votes (31.88%) in 2024, winning by a margin of +4,543 votes over AAP's Kuldeep Singh Dhaliwal (31,742 votes, 27.88%). A total of 119 booths (53.6%) flipped political allegiance between 2022 and 2024, reflecting substantial volatility across both border-rural villages and semi-urban clusters.</w:t>
-      </w:r>
-    </w:p>
-    <w:p>
-      <w:r>
-        <w:t>Key party trajectories in 12-Raja Sansi include:</w:t>
-        <w:br/>
-        <w:t>• Aam Aadmi Party (AAP): Gained +11 booths net, expanding from 58 booth victories in 2022 to 69 booth victories in 2024. AAP gained 46 new booths while conceding 35 booths previously won in 2022.</w:t>
-        <w:br/>
-        <w:t>• Indian National Congress (INC): Expanded booth wins from 98 in 2022 to 112 in 2024 (+14 booths), consolidating a 4,543 vote cushion.</w:t>
-        <w:br/>
-        <w:t>• Shiromani Akali Dal (SAD): Suffered a catastrophic collapse, plummeting from 65 booths won in 2022 (Vir Singh Lopoke) to just 29 booths in 2024 (Anil Joshi), shedding 20,890 votes (-10.86% vote share swing).</w:t>
-        <w:br/>
-        <w:t>• Bharatiya Janata Party (BJP): Reached an all-time high in Raja Sansi, surging from 1 booth (2,373 votes, 1.78%) in 2022 to 11 booth wins (11,680 votes, 10.26%), gaining +8.48% vote share and establishing dedicated pockets of urban and peri-urban influence.</w:t>
+        <w:t>In the 2024 Parliamentary elections, 12-Raja Sansi (part of Amritsar PC) witnessed significant electoral shifts compared to 2022. Overall voter turnout contracted by 19,426 votes (-14.58%), dropping from 133,259 votes in 2022 to 113,833 votes in 2024. While Congress (INC) retained the overall lead in both elections, its victory margin narrowed from +5,474 votes (Sukhbinder Singh Sarkaria in 2022) to +4,543 votes (Gurjeet Singh Aujla in 2024). Concurrently, AAP expanded its booth footprint from 58 booth wins in 2022 to 69 booth wins in 2024 (+11 booths), while Akali Dal suffered severe contraction from 65 booths down to 29 booths (-36 booths), and BJP expanded from 1 booth to 11 booth wins.</w:t>
       </w:r>
     </w:p>
     <w:tbl>
@@ -101,17 +118,16 @@
         <w:tblLook w:firstColumn="1" w:firstRow="1" w:lastColumn="0" w:lastRow="0" w:noHBand="0" w:noVBand="1" w:val="04A0"/>
       </w:tblPr>
       <w:tblGrid>
-        <w:gridCol w:w="1680"/>
-        <w:gridCol w:w="1680"/>
-        <w:gridCol w:w="1680"/>
-        <w:gridCol w:w="1680"/>
-        <w:gridCol w:w="1680"/>
-        <w:gridCol w:w="1680"/>
+        <w:gridCol w:w="2016"/>
+        <w:gridCol w:w="2016"/>
+        <w:gridCol w:w="2016"/>
+        <w:gridCol w:w="2016"/>
+        <w:gridCol w:w="2016"/>
       </w:tblGrid>
       <w:tr>
         <w:tc>
           <w:tcPr>
-            <w:tcW w:type="dxa" w:w="1680"/>
+            <w:tcW w:type="dxa" w:w="2016"/>
             <w:shd w:fill="1F4E79"/>
           </w:tcPr>
           <w:p>
@@ -126,7 +142,7 @@
         </w:tc>
         <w:tc>
           <w:tcPr>
-            <w:tcW w:type="dxa" w:w="1680"/>
+            <w:tcW w:type="dxa" w:w="2016"/>
             <w:shd w:fill="1F4E79"/>
           </w:tcPr>
           <w:p>
@@ -141,7 +157,7 @@
         </w:tc>
         <w:tc>
           <w:tcPr>
-            <w:tcW w:type="dxa" w:w="1680"/>
+            <w:tcW w:type="dxa" w:w="2016"/>
             <w:shd w:fill="1F4E79"/>
           </w:tcPr>
           <w:p>
@@ -156,7 +172,7 @@
         </w:tc>
         <w:tc>
           <w:tcPr>
-            <w:tcW w:type="dxa" w:w="1680"/>
+            <w:tcW w:type="dxa" w:w="2016"/>
             <w:shd w:fill="1F4E79"/>
           </w:tcPr>
           <w:p>
@@ -171,7 +187,7 @@
         </w:tc>
         <w:tc>
           <w:tcPr>
-            <w:tcW w:type="dxa" w:w="1680"/>
+            <w:tcW w:type="dxa" w:w="2016"/>
             <w:shd w:fill="1F4E79"/>
           </w:tcPr>
           <w:p>
@@ -184,26 +200,11 @@
             </w:r>
           </w:p>
         </w:tc>
-        <w:tc>
-          <w:tcPr>
-            <w:tcW w:type="dxa" w:w="1680"/>
-            <w:shd w:fill="1F4E79"/>
-          </w:tcPr>
-          <w:p>
-            <w:r>
-              <w:rPr>
-                <w:b/>
-                <w:color w:val="FFFFFF"/>
-              </w:rPr>
-              <w:t>Net Shift</w:t>
-            </w:r>
-          </w:p>
-        </w:tc>
       </w:tr>
       <w:tr>
         <w:tc>
           <w:tcPr>
-            <w:tcW w:type="dxa" w:w="1680"/>
+            <w:tcW w:type="dxa" w:w="2016"/>
           </w:tcPr>
           <w:p>
             <w:r>
@@ -213,51 +214,41 @@
         </w:tc>
         <w:tc>
           <w:tcPr>
-            <w:tcW w:type="dxa" w:w="1680"/>
+            <w:tcW w:type="dxa" w:w="2016"/>
           </w:tcPr>
           <w:p>
             <w:r>
-              <w:t>46,802</w:t>
+              <w:t>45,043</w:t>
             </w:r>
           </w:p>
         </w:tc>
         <w:tc>
           <w:tcPr>
-            <w:tcW w:type="dxa" w:w="1680"/>
+            <w:tcW w:type="dxa" w:w="2016"/>
           </w:tcPr>
           <w:p>
             <w:r>
-              <w:t>35.12%</w:t>
+              <w:t>33.80%</w:t>
             </w:r>
           </w:p>
         </w:tc>
         <w:tc>
           <w:tcPr>
-            <w:tcW w:type="dxa" w:w="1680"/>
+            <w:tcW w:type="dxa" w:w="2016"/>
           </w:tcPr>
           <w:p>
             <w:r>
-              <w:t>36,285</w:t>
+              <w:t>42,408</w:t>
             </w:r>
           </w:p>
         </w:tc>
         <w:tc>
           <w:tcPr>
-            <w:tcW w:type="dxa" w:w="1680"/>
+            <w:tcW w:type="dxa" w:w="2016"/>
           </w:tcPr>
           <w:p>
             <w:r>
-              <w:t>31.88%</w:t>
-            </w:r>
-          </w:p>
-        </w:tc>
-        <w:tc>
-          <w:tcPr>
-            <w:tcW w:type="dxa" w:w="1680"/>
-          </w:tcPr>
-          <w:p>
-            <w:r>
-              <w:t>-10,517 (-3.24%)</w:t>
+              <w:t>37.25%</w:t>
             </w:r>
           </w:p>
         </w:tc>
@@ -265,7 +256,7 @@
       <w:tr>
         <w:tc>
           <w:tcPr>
-            <w:tcW w:type="dxa" w:w="1680"/>
+            <w:tcW w:type="dxa" w:w="2016"/>
           </w:tcPr>
           <w:p>
             <w:r>
@@ -275,51 +266,41 @@
         </w:tc>
         <w:tc>
           <w:tcPr>
-            <w:tcW w:type="dxa" w:w="1680"/>
+            <w:tcW w:type="dxa" w:w="2016"/>
           </w:tcPr>
           <w:p>
             <w:r>
-              <w:t>37,264</w:t>
+              <w:t>38,125</w:t>
             </w:r>
           </w:p>
         </w:tc>
         <w:tc>
           <w:tcPr>
-            <w:tcW w:type="dxa" w:w="1680"/>
+            <w:tcW w:type="dxa" w:w="2016"/>
           </w:tcPr>
           <w:p>
             <w:r>
-              <w:t>27.96%</w:t>
+              <w:t>28.61%</w:t>
             </w:r>
           </w:p>
         </w:tc>
         <w:tc>
           <w:tcPr>
-            <w:tcW w:type="dxa" w:w="1680"/>
+            <w:tcW w:type="dxa" w:w="2016"/>
           </w:tcPr>
           <w:p>
             <w:r>
-              <w:t>31,742</w:t>
+              <w:t>37,865</w:t>
             </w:r>
           </w:p>
         </w:tc>
         <w:tc>
           <w:tcPr>
-            <w:tcW w:type="dxa" w:w="1680"/>
+            <w:tcW w:type="dxa" w:w="2016"/>
           </w:tcPr>
           <w:p>
             <w:r>
-              <w:t>27.88%</w:t>
-            </w:r>
-          </w:p>
-        </w:tc>
-        <w:tc>
-          <w:tcPr>
-            <w:tcW w:type="dxa" w:w="1680"/>
-          </w:tcPr>
-          <w:p>
-            <w:r>
-              <w:t>-5,522 (-0.08%)</w:t>
+              <w:t>33.26%</w:t>
             </w:r>
           </w:p>
         </w:tc>
@@ -327,7 +308,7 @@
       <w:tr>
         <w:tc>
           <w:tcPr>
-            <w:tcW w:type="dxa" w:w="1680"/>
+            <w:tcW w:type="dxa" w:w="2016"/>
           </w:tcPr>
           <w:p>
             <w:r>
@@ -337,51 +318,41 @@
         </w:tc>
         <w:tc>
           <w:tcPr>
-            <w:tcW w:type="dxa" w:w="1680"/>
+            <w:tcW w:type="dxa" w:w="2016"/>
           </w:tcPr>
           <w:p>
             <w:r>
-              <w:t>41,333</w:t>
+              <w:t>39,569</w:t>
             </w:r>
           </w:p>
         </w:tc>
         <w:tc>
           <w:tcPr>
-            <w:tcW w:type="dxa" w:w="1680"/>
+            <w:tcW w:type="dxa" w:w="2016"/>
           </w:tcPr>
           <w:p>
             <w:r>
-              <w:t>31.02%</w:t>
+              <w:t>29.69%</w:t>
             </w:r>
           </w:p>
         </w:tc>
         <w:tc>
           <w:tcPr>
-            <w:tcW w:type="dxa" w:w="1680"/>
+            <w:tcW w:type="dxa" w:w="2016"/>
           </w:tcPr>
           <w:p>
             <w:r>
-              <w:t>20,443</w:t>
+              <w:t>21,874</w:t>
             </w:r>
           </w:p>
         </w:tc>
         <w:tc>
           <w:tcPr>
-            <w:tcW w:type="dxa" w:w="1680"/>
+            <w:tcW w:type="dxa" w:w="2016"/>
           </w:tcPr>
           <w:p>
             <w:r>
-              <w:t>17.96%</w:t>
-            </w:r>
-          </w:p>
-        </w:tc>
-        <w:tc>
-          <w:tcPr>
-            <w:tcW w:type="dxa" w:w="1680"/>
-          </w:tcPr>
-          <w:p>
-            <w:r>
-              <w:t>-20,890 (-13.06%)</w:t>
+              <w:t>19.22%</w:t>
             </w:r>
           </w:p>
         </w:tc>
@@ -389,7 +360,7 @@
       <w:tr>
         <w:tc>
           <w:tcPr>
-            <w:tcW w:type="dxa" w:w="1680"/>
+            <w:tcW w:type="dxa" w:w="2016"/>
           </w:tcPr>
           <w:p>
             <w:r>
@@ -399,51 +370,41 @@
         </w:tc>
         <w:tc>
           <w:tcPr>
-            <w:tcW w:type="dxa" w:w="1680"/>
+            <w:tcW w:type="dxa" w:w="2016"/>
           </w:tcPr>
           <w:p>
             <w:r>
-              <w:t>2,373</w:t>
+              <w:t>1,544</w:t>
             </w:r>
           </w:p>
         </w:tc>
         <w:tc>
           <w:tcPr>
-            <w:tcW w:type="dxa" w:w="1680"/>
+            <w:tcW w:type="dxa" w:w="2016"/>
           </w:tcPr>
           <w:p>
             <w:r>
-              <w:t>1.78%</w:t>
+              <w:t>1.16%</w:t>
             </w:r>
           </w:p>
         </w:tc>
         <w:tc>
           <w:tcPr>
-            <w:tcW w:type="dxa" w:w="1680"/>
+            <w:tcW w:type="dxa" w:w="2016"/>
           </w:tcPr>
           <w:p>
             <w:r>
-              <w:t>11,680</w:t>
+              <w:t>7,370</w:t>
             </w:r>
           </w:p>
         </w:tc>
         <w:tc>
           <w:tcPr>
-            <w:tcW w:type="dxa" w:w="1680"/>
+            <w:tcW w:type="dxa" w:w="2016"/>
           </w:tcPr>
           <w:p>
             <w:r>
-              <w:t>10.26%</w:t>
-            </w:r>
-          </w:p>
-        </w:tc>
-        <w:tc>
-          <w:tcPr>
-            <w:tcW w:type="dxa" w:w="1680"/>
-          </w:tcPr>
-          <w:p>
-            <w:r>
-              <w:t>+9,307 (+8.48%)</w:t>
+              <w:t>6.47%</w:t>
             </w:r>
           </w:p>
         </w:tc>
@@ -451,61 +412,51 @@
       <w:tr>
         <w:tc>
           <w:tcPr>
-            <w:tcW w:type="dxa" w:w="1680"/>
+            <w:tcW w:type="dxa" w:w="2016"/>
           </w:tcPr>
           <w:p>
             <w:r>
-              <w:t>SAD-A (Amritsar)</w:t>
+              <w:t>SAD(A) &amp; Others</w:t>
             </w:r>
           </w:p>
         </w:tc>
         <w:tc>
           <w:tcPr>
-            <w:tcW w:type="dxa" w:w="1680"/>
+            <w:tcW w:type="dxa" w:w="2016"/>
           </w:tcPr>
           <w:p>
             <w:r>
-              <w:t>—</w:t>
+              <w:t>8,978</w:t>
             </w:r>
           </w:p>
         </w:tc>
         <w:tc>
           <w:tcPr>
-            <w:tcW w:type="dxa" w:w="1680"/>
+            <w:tcW w:type="dxa" w:w="2016"/>
           </w:tcPr>
           <w:p>
             <w:r>
-              <w:t>—</w:t>
+              <w:t>6.74%</w:t>
             </w:r>
           </w:p>
         </w:tc>
         <w:tc>
           <w:tcPr>
-            <w:tcW w:type="dxa" w:w="1680"/>
+            <w:tcW w:type="dxa" w:w="2016"/>
           </w:tcPr>
           <w:p>
             <w:r>
-              <w:t>2,499</w:t>
+              <w:t>4,316</w:t>
             </w:r>
           </w:p>
         </w:tc>
         <w:tc>
           <w:tcPr>
-            <w:tcW w:type="dxa" w:w="1680"/>
+            <w:tcW w:type="dxa" w:w="2016"/>
           </w:tcPr>
           <w:p>
             <w:r>
-              <w:t>2.20%</w:t>
-            </w:r>
-          </w:p>
-        </w:tc>
-        <w:tc>
-          <w:tcPr>
-            <w:tcW w:type="dxa" w:w="1680"/>
-          </w:tcPr>
-          <w:p>
-            <w:r>
-              <w:t>+2,499 (+2.20%)</w:t>
+              <w:t>3.80%</w:t>
             </w:r>
           </w:p>
         </w:tc>
@@ -513,69 +464,7 @@
       <w:tr>
         <w:tc>
           <w:tcPr>
-            <w:tcW w:type="dxa" w:w="1680"/>
-          </w:tcPr>
-          <w:p>
-            <w:r>
-              <w:t>Others &amp; NOTA</w:t>
-            </w:r>
-          </w:p>
-        </w:tc>
-        <w:tc>
-          <w:tcPr>
-            <w:tcW w:type="dxa" w:w="1680"/>
-          </w:tcPr>
-          <w:p>
-            <w:r>
-              <w:t>5,487</w:t>
-            </w:r>
-          </w:p>
-        </w:tc>
-        <w:tc>
-          <w:tcPr>
-            <w:tcW w:type="dxa" w:w="1680"/>
-          </w:tcPr>
-          <w:p>
-            <w:r>
-              <w:t>4.12%</w:t>
-            </w:r>
-          </w:p>
-        </w:tc>
-        <w:tc>
-          <w:tcPr>
-            <w:tcW w:type="dxa" w:w="1680"/>
-          </w:tcPr>
-          <w:p>
-            <w:r>
-              <w:t>11,184</w:t>
-            </w:r>
-          </w:p>
-        </w:tc>
-        <w:tc>
-          <w:tcPr>
-            <w:tcW w:type="dxa" w:w="1680"/>
-          </w:tcPr>
-          <w:p>
-            <w:r>
-              <w:t>9.82%</w:t>
-            </w:r>
-          </w:p>
-        </w:tc>
-        <w:tc>
-          <w:tcPr>
-            <w:tcW w:type="dxa" w:w="1680"/>
-          </w:tcPr>
-          <w:p>
-            <w:r>
-              <w:t>+5,697 (+5.70%)</w:t>
-            </w:r>
-          </w:p>
-        </w:tc>
-      </w:tr>
-      <w:tr>
-        <w:tc>
-          <w:tcPr>
-            <w:tcW w:type="dxa" w:w="1680"/>
+            <w:tcW w:type="dxa" w:w="2016"/>
             <w:shd w:fill="D9E1F2"/>
           </w:tcPr>
           <w:p>
@@ -589,7 +478,7 @@
         </w:tc>
         <w:tc>
           <w:tcPr>
-            <w:tcW w:type="dxa" w:w="1680"/>
+            <w:tcW w:type="dxa" w:w="2016"/>
             <w:shd w:fill="D9E1F2"/>
           </w:tcPr>
           <w:p>
@@ -603,7 +492,7 @@
         </w:tc>
         <w:tc>
           <w:tcPr>
-            <w:tcW w:type="dxa" w:w="1680"/>
+            <w:tcW w:type="dxa" w:w="2016"/>
             <w:shd w:fill="D9E1F2"/>
           </w:tcPr>
           <w:p>
@@ -617,7 +506,7 @@
         </w:tc>
         <w:tc>
           <w:tcPr>
-            <w:tcW w:type="dxa" w:w="1680"/>
+            <w:tcW w:type="dxa" w:w="2016"/>
             <w:shd w:fill="D9E1F2"/>
           </w:tcPr>
           <w:p>
@@ -631,7 +520,7 @@
         </w:tc>
         <w:tc>
           <w:tcPr>
-            <w:tcW w:type="dxa" w:w="1680"/>
+            <w:tcW w:type="dxa" w:w="2016"/>
             <w:shd w:fill="D9E1F2"/>
           </w:tcPr>
           <w:p>
@@ -640,20 +529,6 @@
                 <w:b/>
               </w:rPr>
               <w:t>100.0%</w:t>
-            </w:r>
-          </w:p>
-        </w:tc>
-        <w:tc>
-          <w:tcPr>
-            <w:tcW w:type="dxa" w:w="1680"/>
-            <w:shd w:fill="D9E1F2"/>
-          </w:tcPr>
-          <w:p>
-            <w:r>
-              <w:rPr>
-                <w:b/>
-              </w:rPr>
-              <w:t>-19,426 (-14.58%)</w:t>
             </w:r>
           </w:p>
         </w:tc>
@@ -669,12 +544,12 @@
         <w:pStyle w:val="Heading1"/>
       </w:pPr>
       <w:r>
-        <w:t>2. AAP (Aam Aadmi Party) Strategic Booth Categorization</w:t>
+        <w:t>2. AAP (Aam Aadmi Party) Booth-Level Categorization</w:t>
       </w:r>
     </w:p>
     <w:p>
       <w:r>
-        <w:t>All 222 booths in 12-Raja Sansi have been categorized into 5 actionable operational groups to drive grassroots field interventions, cadre deployment, and voter retention:</w:t>
+        <w:t>All 222 booths in Raja Sansi have been categorized into 5 distinct operational groups to guide field strategy, retention efforts, and vulnerability management:</w:t>
       </w:r>
     </w:p>
     <w:tbl>
@@ -746,7 +621,7 @@
                 <w:b/>
                 <w:color w:val="FFFFFF"/>
               </w:rPr>
-              <w:t>Strategic Field Assessment</w:t>
+              <w:t>Strategic Assessment</w:t>
             </w:r>
           </w:p>
         </w:tc>
@@ -788,7 +663,7 @@
           </w:tcPr>
           <w:p>
             <w:r>
-              <w:t>Reliable AAP strongholds (Gulgarh, Nangal Sohal, Bhala Pind, आदि). Maintain cadre vigilance and protect local committees.</w:t>
+              <w:t>Solid AAP fortresses (Gulgarh, Jhunj, Meerankot Kalan, Kaler). Must protect and nurture local leadership.</w:t>
             </w:r>
           </w:p>
         </w:tc>
@@ -830,7 +705,7 @@
           </w:tcPr>
           <w:p>
             <w:r>
-              <w:t>Major expansion areas flipped from SAD (32 booths) and INC (14 booths). Crucial consolidation zones for the upcoming Assembly election.</w:t>
+              <w:t>Major surge areas flipped from INC (37 booths) and SAD (9 booths). High priority for consolidating grassroot base.</w:t>
             </w:r>
           </w:p>
         </w:tc>
@@ -862,7 +737,7 @@
           </w:tcPr>
           <w:p>
             <w:r>
-              <w:t>Deficit swing to INC/BJP</w:t>
+              <w:t>Deficit swing to INC/BJP/SAD</w:t>
             </w:r>
           </w:p>
         </w:tc>
@@ -872,7 +747,7 @@
           </w:tcPr>
           <w:p>
             <w:r>
-              <w:t>Booths won by AAP in 2022 that slipped away in 2024 (29 to INC, 4 to SAD, 2 to BJP). High-priority recovery zones requiring immediate grievances redressal.</w:t>
+              <w:t>Booths won in 2022 that flipped to rivals (25 to INC, 5 to BJP, 5 to SAD). Immediate redressal needed.</w:t>
             </w:r>
           </w:p>
         </w:tc>
@@ -904,7 +779,7 @@
           </w:tcPr>
           <w:p>
             <w:r>
-              <w:t>Critical minority vote share</w:t>
+              <w:t>Severe minority vote share</w:t>
             </w:r>
           </w:p>
         </w:tc>
@@ -914,7 +789,7 @@
           </w:tcPr>
           <w:p>
             <w:r>
-              <w:t>Pockets where AAP failed to cross 20% vote share in 2024. Requires structural ground rebuild and village-specific outreach.</w:t>
+              <w:t>Pockets with critical vulnerability where AAP polled below 20% (e.g. Toor, Saranghar, sensitive border pockets).</w:t>
             </w:r>
           </w:p>
         </w:tc>
@@ -946,7 +821,7 @@
           </w:tcPr>
           <w:p>
             <w:r>
-              <w:t>Opponent fortresses</w:t>
+              <w:t>Opponent bastions</w:t>
             </w:r>
           </w:p>
         </w:tc>
@@ -956,7 +831,7 @@
           </w:tcPr>
           <w:p>
             <w:r>
-              <w:t>Traditional Congress bastions and Akali strongholds where AAP has historically remained 2nd or 3rd.</w:t>
+              <w:t>Traditional Congress and Akali stronghold villages where AAP has remained in 2nd or 3rd position.</w:t>
             </w:r>
           </w:p>
         </w:tc>
@@ -972,7 +847,7 @@
         <w:pStyle w:val="Heading2"/>
       </w:pPr>
       <w:r>
-        <w:t>3. AAP Top 15 Strongholds (Won Both Times)</w:t>
+        <w:t>3. AAP Priority Focus Booths (Top 10 Strongholds vs Top 10 Weaknesses)</w:t>
       </w:r>
     </w:p>
     <w:tbl>
@@ -1016,7 +891,7 @@
                 <w:b/>
                 <w:color w:val="FFFFFF"/>
               </w:rPr>
-              <w:t>Village / Polling Station</w:t>
+              <w:t>Village Name</w:t>
             </w:r>
           </w:p>
         </w:tc>
@@ -1061,7 +936,7 @@
                 <w:b/>
                 <w:color w:val="FFFFFF"/>
               </w:rPr>
-              <w:t>2024 Lead Margin</w:t>
+              <w:t>2024 Margin</w:t>
             </w:r>
           </w:p>
         </w:tc>
@@ -1099,8 +974,6 @@
           <w:p>
             <w:r>
               <w:t>Rajasansi Ward No. 9 Ghar Mandi Road + Ward No. 9 Gali Chhibia Wali + Ward No. 9 Ghar Mandi Rajasansi + Ward No. 9 Sahamne Bagichi + Ward No. 9 Gali Dhobia Wali</w:t>
-              <w:br/>
-              <w:t>(ਰਾਜਾਸਾਂਸੀ ਵਾਰਡ ਨੰ. 9 ਘਰ ਮੰਡੀ ਰੋਡ + ਵਾਰਡ ਨੰ. 9 ਗਲੀ ਛੀਬਿਆਂ ਵਾਲੀ + ਵਾਰਡ ਨੰ. 9 ਘਰ ਮੰਡੀ ਰਾਜਾਸਾਂਸੀ + ਵਾਰਡ ਨੰ. 9 ਸਾਹਮਣੇ ਬਗੀਚੀ + ਵਾਰਡ ਨੰ. 9 ਗਲੀ ਧੋਬੀਆਂ ਵਾਲੀ)</w:t>
             </w:r>
           </w:p>
         </w:tc>
@@ -1140,7 +1013,193 @@
           </w:tcPr>
           <w:p>
             <w:r>
-              <w:t>AAP Won (+85)</w:t>
+              <w:t>AAP (+85)</w:t>
+            </w:r>
+          </w:p>
+        </w:tc>
+      </w:tr>
+      <w:tr>
+        <w:tc>
+          <w:tcPr>
+            <w:tcW w:type="dxa" w:w="1680"/>
+          </w:tcPr>
+          <w:p>
+            <w:r>
+              <w:t>#87</w:t>
+            </w:r>
+          </w:p>
+        </w:tc>
+        <w:tc>
+          <w:tcPr>
+            <w:tcW w:type="dxa" w:w="1680"/>
+          </w:tcPr>
+          <w:p>
+            <w:r>
+              <w:t>Kotli Koretana</w:t>
+            </w:r>
+          </w:p>
+        </w:tc>
+        <w:tc>
+          <w:tcPr>
+            <w:tcW w:type="dxa" w:w="1680"/>
+          </w:tcPr>
+          <w:p>
+            <w:r>
+              <w:t>359</w:t>
+            </w:r>
+          </w:p>
+        </w:tc>
+        <w:tc>
+          <w:tcPr>
+            <w:tcW w:type="dxa" w:w="1680"/>
+          </w:tcPr>
+          <w:p>
+            <w:r>
+              <w:t>63.99%</w:t>
+            </w:r>
+          </w:p>
+        </w:tc>
+        <w:tc>
+          <w:tcPr>
+            <w:tcW w:type="dxa" w:w="1680"/>
+          </w:tcPr>
+          <w:p>
+            <w:r>
+              <w:t>+295 lead</w:t>
+            </w:r>
+          </w:p>
+        </w:tc>
+        <w:tc>
+          <w:tcPr>
+            <w:tcW w:type="dxa" w:w="1680"/>
+          </w:tcPr>
+          <w:p>
+            <w:r>
+              <w:t>INC (+82)</w:t>
+            </w:r>
+          </w:p>
+        </w:tc>
+      </w:tr>
+      <w:tr>
+        <w:tc>
+          <w:tcPr>
+            <w:tcW w:type="dxa" w:w="1680"/>
+          </w:tcPr>
+          <w:p>
+            <w:r>
+              <w:t>#192</w:t>
+            </w:r>
+          </w:p>
+        </w:tc>
+        <w:tc>
+          <w:tcPr>
+            <w:tcW w:type="dxa" w:w="1680"/>
+          </w:tcPr>
+          <w:p>
+            <w:r>
+              <w:t>Jhojeti</w:t>
+            </w:r>
+          </w:p>
+        </w:tc>
+        <w:tc>
+          <w:tcPr>
+            <w:tcW w:type="dxa" w:w="1680"/>
+          </w:tcPr>
+          <w:p>
+            <w:r>
+              <w:t>348</w:t>
+            </w:r>
+          </w:p>
+        </w:tc>
+        <w:tc>
+          <w:tcPr>
+            <w:tcW w:type="dxa" w:w="1680"/>
+          </w:tcPr>
+          <w:p>
+            <w:r>
+              <w:t>66.41%</w:t>
+            </w:r>
+          </w:p>
+        </w:tc>
+        <w:tc>
+          <w:tcPr>
+            <w:tcW w:type="dxa" w:w="1680"/>
+          </w:tcPr>
+          <w:p>
+            <w:r>
+              <w:t>+256 lead</w:t>
+            </w:r>
+          </w:p>
+        </w:tc>
+        <w:tc>
+          <w:tcPr>
+            <w:tcW w:type="dxa" w:w="1680"/>
+          </w:tcPr>
+          <w:p>
+            <w:r>
+              <w:t>INC (+200)</w:t>
+            </w:r>
+          </w:p>
+        </w:tc>
+      </w:tr>
+      <w:tr>
+        <w:tc>
+          <w:tcPr>
+            <w:tcW w:type="dxa" w:w="1680"/>
+          </w:tcPr>
+          <w:p>
+            <w:r>
+              <w:t>#216</w:t>
+            </w:r>
+          </w:p>
+        </w:tc>
+        <w:tc>
+          <w:tcPr>
+            <w:tcW w:type="dxa" w:w="1680"/>
+          </w:tcPr>
+          <w:p>
+            <w:r>
+              <w:t>Ladeh</w:t>
+            </w:r>
+          </w:p>
+        </w:tc>
+        <w:tc>
+          <w:tcPr>
+            <w:tcW w:type="dxa" w:w="1680"/>
+          </w:tcPr>
+          <w:p>
+            <w:r>
+              <w:t>321</w:t>
+            </w:r>
+          </w:p>
+        </w:tc>
+        <w:tc>
+          <w:tcPr>
+            <w:tcW w:type="dxa" w:w="1680"/>
+          </w:tcPr>
+          <w:p>
+            <w:r>
+              <w:t>57.02%</w:t>
+            </w:r>
+          </w:p>
+        </w:tc>
+        <w:tc>
+          <w:tcPr>
+            <w:tcW w:type="dxa" w:w="1680"/>
+          </w:tcPr>
+          <w:p>
+            <w:r>
+              <w:t>+233 lead</w:t>
+            </w:r>
+          </w:p>
+        </w:tc>
+        <w:tc>
+          <w:tcPr>
+            <w:tcW w:type="dxa" w:w="1680"/>
+          </w:tcPr>
+          <w:p>
+            <w:r>
+              <w:t>INC (+73)</w:t>
             </w:r>
           </w:p>
         </w:tc>
@@ -1163,8 +1222,6 @@
           <w:p>
             <w:r>
               <w:t>Ward No. 9 Main Bazar Gali Lohara Wali + Ward No. 9 Gali Mistri Mehar Singh Wali + Ward No. 9 Gali Mistri Mehar Singh Wali + Ward No. 9 Sahamne Bagichi</w:t>
-              <w:br/>
-              <w:t>(ਵਾਰਡ ਨੰ.9 ਮੇਨ ਬਜਾਰ ਗਲੀ ਲੋਹਾਰਾਂ ਵਾਲੀ + ਵਾਰਡ ਨੰ.9 ਗਲੀ ਮਿਸਤਰੀ ਮੇਹਰ ਸਿੰਘ ਵਾਲੀ + ਵਾਰਡ ਨੰ.9 ਗਲੀ ਮਿਸਤਰੀ ਮੇਹਰ ਸਿੰਘ ਵਾਲੀ + ਵਾਰਡ ਨੰ. 9 ਸਾਹਮਣੇ ਬਗੀਚੀ)</w:t>
             </w:r>
           </w:p>
         </w:tc>
@@ -1204,7 +1261,7 @@
           </w:tcPr>
           <w:p>
             <w:r>
-              <w:t>AAP Won (+59)</w:t>
+              <w:t>AAP (+59)</w:t>
             </w:r>
           </w:p>
         </w:tc>
@@ -1227,8 +1284,6 @@
           <w:p>
             <w:r>
               <w:t>Ward No. 13 Gali Lohara Wali + Ward No. 13 Muhalla Masit Wala + Ward No. 13 Main Bazar Sahamne Muhalla Thakar Singh Wala + Ward No. 13 Main Bazar Sahamne Muhalla Thakar Singh Wala + Overseas Elector</w:t>
-              <w:br/>
-              <w:t>(ਵਾਰਡ ਨੰ.13 ਗਲੀ ਲੋਹਾਰਾਂ ਵਾਲੀ + ਵਾਰਡ ਨੰ.13 ਮੁਹੱਲਾ ਮਸੀਤ ਵਾਲਾ + ਵਾਰਡ ਨੰ.13 ਮੇਨ ਬਜਾਰ ਸਾਹਮਣੇ ਮੁਹੱਲਾ ਠਾਕਰ ਸਿੰਘ ਵਾਲਾ + ਵਾਰਡ ਨੰ.13 ਮੇਨ ਬਜਾਰ ਸਾਹਮਣੇ ਮੁਹੱਲਾ ਠਾਕਰ ਸਿੰਘ ਵਾਲਾ + ਓਵਰਸੀਜ਼ ਇਲੈਕਟਰ)</w:t>
             </w:r>
           </w:p>
         </w:tc>
@@ -1268,7 +1323,7 @@
           </w:tcPr>
           <w:p>
             <w:r>
-              <w:t>AAP Won (+59)</w:t>
+              <w:t>AAP (+59)</w:t>
             </w:r>
           </w:p>
         </w:tc>
@@ -1291,8 +1346,6 @@
           <w:p>
             <w:r>
               <w:t>Talla</w:t>
-              <w:br/>
-              <w:t>(ਤੱਲਾ)</w:t>
             </w:r>
           </w:p>
         </w:tc>
@@ -1332,7 +1385,7 @@
           </w:tcPr>
           <w:p>
             <w:r>
-              <w:t>AAP Won (+151)</w:t>
+              <w:t>AAP (+151)</w:t>
             </w:r>
           </w:p>
         </w:tc>
@@ -1344,7 +1397,7 @@
           </w:tcPr>
           <w:p>
             <w:r>
-              <w:t>#179</w:t>
+              <w:t>#193</w:t>
             </w:r>
           </w:p>
         </w:tc>
@@ -1354,9 +1407,7 @@
           </w:tcPr>
           <w:p>
             <w:r>
-              <w:t>Bagga Kalan</w:t>
-              <w:br/>
-              <w:t>(ਬੱਗਾ ਕਲਾਂ)</w:t>
+              <w:t>Jhanjoti</w:t>
             </w:r>
           </w:p>
         </w:tc>
@@ -1366,7 +1417,7 @@
           </w:tcPr>
           <w:p>
             <w:r>
-              <w:t>244</w:t>
+              <w:t>309</w:t>
             </w:r>
           </w:p>
         </w:tc>
@@ -1376,7 +1427,7 @@
           </w:tcPr>
           <w:p>
             <w:r>
-              <w:t>50.83%</w:t>
+              <w:t>59.08%</w:t>
             </w:r>
           </w:p>
         </w:tc>
@@ -1386,7 +1437,7 @@
           </w:tcPr>
           <w:p>
             <w:r>
-              <w:t>+62 lead</w:t>
+              <w:t>+193 lead</w:t>
             </w:r>
           </w:p>
         </w:tc>
@@ -1396,199 +1447,7 @@
           </w:tcPr>
           <w:p>
             <w:r>
-              <w:t>AAP Won (+88)</w:t>
-            </w:r>
-          </w:p>
-        </w:tc>
-      </w:tr>
-      <w:tr>
-        <w:tc>
-          <w:tcPr>
-            <w:tcW w:type="dxa" w:w="1680"/>
-          </w:tcPr>
-          <w:p>
-            <w:r>
-              <w:t>#51</w:t>
-            </w:r>
-          </w:p>
-        </w:tc>
-        <w:tc>
-          <w:tcPr>
-            <w:tcW w:type="dxa" w:w="1680"/>
-          </w:tcPr>
-          <w:p>
-            <w:r>
-              <w:t>Panderi + Madhpura</w:t>
-              <w:br/>
-              <w:t>(ਪੰਡੇਰੀ + ਮੱਧਪੁਰਾ)</w:t>
-            </w:r>
-          </w:p>
-        </w:tc>
-        <w:tc>
-          <w:tcPr>
-            <w:tcW w:type="dxa" w:w="1680"/>
-          </w:tcPr>
-          <w:p>
-            <w:r>
-              <w:t>211</w:t>
-            </w:r>
-          </w:p>
-        </w:tc>
-        <w:tc>
-          <w:tcPr>
-            <w:tcW w:type="dxa" w:w="1680"/>
-          </w:tcPr>
-          <w:p>
-            <w:r>
-              <w:t>48.51%</w:t>
-            </w:r>
-          </w:p>
-        </w:tc>
-        <w:tc>
-          <w:tcPr>
-            <w:tcW w:type="dxa" w:w="1680"/>
-          </w:tcPr>
-          <w:p>
-            <w:r>
-              <w:t>+110 lead</w:t>
-            </w:r>
-          </w:p>
-        </w:tc>
-        <w:tc>
-          <w:tcPr>
-            <w:tcW w:type="dxa" w:w="1680"/>
-          </w:tcPr>
-          <w:p>
-            <w:r>
-              <w:t>AAP Won (+39)</w:t>
-            </w:r>
-          </w:p>
-        </w:tc>
-      </w:tr>
-      <w:tr>
-        <w:tc>
-          <w:tcPr>
-            <w:tcW w:type="dxa" w:w="1680"/>
-          </w:tcPr>
-          <w:p>
-            <w:r>
-              <w:t>#175</w:t>
-            </w:r>
-          </w:p>
-        </w:tc>
-        <w:tc>
-          <w:tcPr>
-            <w:tcW w:type="dxa" w:w="1680"/>
-          </w:tcPr>
-          <w:p>
-            <w:r>
-              <w:t>Bhittewad</w:t>
-              <w:br/>
-              <w:t>(ਭਿੱਟੇਵੱਡ)</w:t>
-            </w:r>
-          </w:p>
-        </w:tc>
-        <w:tc>
-          <w:tcPr>
-            <w:tcW w:type="dxa" w:w="1680"/>
-          </w:tcPr>
-          <w:p>
-            <w:r>
-              <w:t>155</w:t>
-            </w:r>
-          </w:p>
-        </w:tc>
-        <w:tc>
-          <w:tcPr>
-            <w:tcW w:type="dxa" w:w="1680"/>
-          </w:tcPr>
-          <w:p>
-            <w:r>
-              <w:t>47.69%</w:t>
-            </w:r>
-          </w:p>
-        </w:tc>
-        <w:tc>
-          <w:tcPr>
-            <w:tcW w:type="dxa" w:w="1680"/>
-          </w:tcPr>
-          <w:p>
-            <w:r>
-              <w:t>+71 lead</w:t>
-            </w:r>
-          </w:p>
-        </w:tc>
-        <w:tc>
-          <w:tcPr>
-            <w:tcW w:type="dxa" w:w="1680"/>
-          </w:tcPr>
-          <w:p>
-            <w:r>
-              <w:t>AAP Won (+51)</w:t>
-            </w:r>
-          </w:p>
-        </w:tc>
-      </w:tr>
-      <w:tr>
-        <w:tc>
-          <w:tcPr>
-            <w:tcW w:type="dxa" w:w="1680"/>
-          </w:tcPr>
-          <w:p>
-            <w:r>
-              <w:t>#128</w:t>
-            </w:r>
-          </w:p>
-        </w:tc>
-        <w:tc>
-          <w:tcPr>
-            <w:tcW w:type="dxa" w:w="1680"/>
-          </w:tcPr>
-          <w:p>
-            <w:r>
-              <w:t>Kamaske + Khijarpura</w:t>
-              <w:br/>
-              <w:t>(ਕਮਾਸਕੇ + ਖਿਜਰਪੁਰਾ)</w:t>
-            </w:r>
-          </w:p>
-        </w:tc>
-        <w:tc>
-          <w:tcPr>
-            <w:tcW w:type="dxa" w:w="1680"/>
-          </w:tcPr>
-          <w:p>
-            <w:r>
-              <w:t>177</w:t>
-            </w:r>
-          </w:p>
-        </w:tc>
-        <w:tc>
-          <w:tcPr>
-            <w:tcW w:type="dxa" w:w="1680"/>
-          </w:tcPr>
-          <w:p>
-            <w:r>
-              <w:t>44.03%</w:t>
-            </w:r>
-          </w:p>
-        </w:tc>
-        <w:tc>
-          <w:tcPr>
-            <w:tcW w:type="dxa" w:w="1680"/>
-          </w:tcPr>
-          <w:p>
-            <w:r>
-              <w:t>+70 lead</w:t>
-            </w:r>
-          </w:p>
-        </w:tc>
-        <w:tc>
-          <w:tcPr>
-            <w:tcW w:type="dxa" w:w="1680"/>
-          </w:tcPr>
-          <w:p>
-            <w:r>
-              <w:t>AAP Won (+27)</w:t>
+              <w:t>INC (+25)</w:t>
             </w:r>
           </w:p>
         </w:tc>
@@ -1611,8 +1470,6 @@
           <w:p>
             <w:r>
               <w:t>Bohlian</w:t>
-              <w:br/>
-              <w:t>(ਬੋਹਲੀਆਂ)</w:t>
             </w:r>
           </w:p>
         </w:tc>
@@ -1652,7 +1509,7 @@
           </w:tcPr>
           <w:p>
             <w:r>
-              <w:t>AAP Won (+133)</w:t>
+              <w:t>AAP (+133)</w:t>
             </w:r>
           </w:p>
         </w:tc>
@@ -1664,7 +1521,7 @@
           </w:tcPr>
           <w:p>
             <w:r>
-              <w:t>#176</w:t>
+              <w:t>#151</w:t>
             </w:r>
           </w:p>
         </w:tc>
@@ -1674,9 +1531,7 @@
           </w:tcPr>
           <w:p>
             <w:r>
-              <w:t>Bhittewad</w:t>
-              <w:br/>
-              <w:t>(ਭਿੱਟੇਵੱਡ)</w:t>
+              <w:t>Chhiddan</w:t>
             </w:r>
           </w:p>
         </w:tc>
@@ -1686,7 +1541,7 @@
           </w:tcPr>
           <w:p>
             <w:r>
-              <w:t>192</w:t>
+              <w:t>289</w:t>
             </w:r>
           </w:p>
         </w:tc>
@@ -1696,7 +1551,7 @@
           </w:tcPr>
           <w:p>
             <w:r>
-              <w:t>42.48%</w:t>
+              <w:t>40.14%</w:t>
             </w:r>
           </w:p>
         </w:tc>
@@ -1706,7 +1561,7 @@
           </w:tcPr>
           <w:p>
             <w:r>
-              <w:t>+90 lead</w:t>
+              <w:t>+134 lead</w:t>
             </w:r>
           </w:p>
         </w:tc>
@@ -1716,327 +1571,7 @@
           </w:tcPr>
           <w:p>
             <w:r>
-              <w:t>AAP Won (+10)</w:t>
-            </w:r>
-          </w:p>
-        </w:tc>
-      </w:tr>
-      <w:tr>
-        <w:tc>
-          <w:tcPr>
-            <w:tcW w:type="dxa" w:w="1680"/>
-          </w:tcPr>
-          <w:p>
-            <w:r>
-              <w:t>#93</w:t>
-            </w:r>
-          </w:p>
-        </w:tc>
-        <w:tc>
-          <w:tcPr>
-            <w:tcW w:type="dxa" w:w="1680"/>
-          </w:tcPr>
-          <w:p>
-            <w:r>
-              <w:t>Mehar</w:t>
-              <w:br/>
-              <w:t>(ਮੇਹਾਰ)</w:t>
-            </w:r>
-          </w:p>
-        </w:tc>
-        <w:tc>
-          <w:tcPr>
-            <w:tcW w:type="dxa" w:w="1680"/>
-          </w:tcPr>
-          <w:p>
-            <w:r>
-              <w:t>213</w:t>
-            </w:r>
-          </w:p>
-        </w:tc>
-        <w:tc>
-          <w:tcPr>
-            <w:tcW w:type="dxa" w:w="1680"/>
-          </w:tcPr>
-          <w:p>
-            <w:r>
-              <w:t>41.44%</w:t>
-            </w:r>
-          </w:p>
-        </w:tc>
-        <w:tc>
-          <w:tcPr>
-            <w:tcW w:type="dxa" w:w="1680"/>
-          </w:tcPr>
-          <w:p>
-            <w:r>
-              <w:t>+74 lead</w:t>
-            </w:r>
-          </w:p>
-        </w:tc>
-        <w:tc>
-          <w:tcPr>
-            <w:tcW w:type="dxa" w:w="1680"/>
-          </w:tcPr>
-          <w:p>
-            <w:r>
-              <w:t>AAP Won (+19)</w:t>
-            </w:r>
-          </w:p>
-        </w:tc>
-      </w:tr>
-      <w:tr>
-        <w:tc>
-          <w:tcPr>
-            <w:tcW w:type="dxa" w:w="1680"/>
-          </w:tcPr>
-          <w:p>
-            <w:r>
-              <w:t>#138</w:t>
-            </w:r>
-          </w:p>
-        </w:tc>
-        <w:tc>
-          <w:tcPr>
-            <w:tcW w:type="dxa" w:w="1680"/>
-          </w:tcPr>
-          <w:p>
-            <w:r>
-              <w:t>Bahirwal</w:t>
-              <w:br/>
-              <w:t>(ਬਹਿੜਵਾਲ)</w:t>
-            </w:r>
-          </w:p>
-        </w:tc>
-        <w:tc>
-          <w:tcPr>
-            <w:tcW w:type="dxa" w:w="1680"/>
-          </w:tcPr>
-          <w:p>
-            <w:r>
-              <w:t>157</w:t>
-            </w:r>
-          </w:p>
-        </w:tc>
-        <w:tc>
-          <w:tcPr>
-            <w:tcW w:type="dxa" w:w="1680"/>
-          </w:tcPr>
-          <w:p>
-            <w:r>
-              <w:t>40.26%</w:t>
-            </w:r>
-          </w:p>
-        </w:tc>
-        <w:tc>
-          <w:tcPr>
-            <w:tcW w:type="dxa" w:w="1680"/>
-          </w:tcPr>
-          <w:p>
-            <w:r>
-              <w:t>+66 lead</w:t>
-            </w:r>
-          </w:p>
-        </w:tc>
-        <w:tc>
-          <w:tcPr>
-            <w:tcW w:type="dxa" w:w="1680"/>
-          </w:tcPr>
-          <w:p>
-            <w:r>
-              <w:t>AAP Won (+133)</w:t>
-            </w:r>
-          </w:p>
-        </w:tc>
-      </w:tr>
-      <w:tr>
-        <w:tc>
-          <w:tcPr>
-            <w:tcW w:type="dxa" w:w="1680"/>
-          </w:tcPr>
-          <w:p>
-            <w:r>
-              <w:t>#82</w:t>
-            </w:r>
-          </w:p>
-        </w:tc>
-        <w:tc>
-          <w:tcPr>
-            <w:tcW w:type="dxa" w:w="1680"/>
-          </w:tcPr>
-          <w:p>
-            <w:r>
-              <w:t>Miadi Kalan + Kotli Muglan</w:t>
-              <w:br/>
-              <w:t>(ਮਿਆਦੀ ਕਲਾਂ + ਕੋਟਲੀ ਮੁਗਲਾਂ)</w:t>
-            </w:r>
-          </w:p>
-        </w:tc>
-        <w:tc>
-          <w:tcPr>
-            <w:tcW w:type="dxa" w:w="1680"/>
-          </w:tcPr>
-          <w:p>
-            <w:r>
-              <w:t>149</w:t>
-            </w:r>
-          </w:p>
-        </w:tc>
-        <w:tc>
-          <w:tcPr>
-            <w:tcW w:type="dxa" w:w="1680"/>
-          </w:tcPr>
-          <w:p>
-            <w:r>
-              <w:t>39.84%</w:t>
-            </w:r>
-          </w:p>
-        </w:tc>
-        <w:tc>
-          <w:tcPr>
-            <w:tcW w:type="dxa" w:w="1680"/>
-          </w:tcPr>
-          <w:p>
-            <w:r>
-              <w:t>+60 lead</w:t>
-            </w:r>
-          </w:p>
-        </w:tc>
-        <w:tc>
-          <w:tcPr>
-            <w:tcW w:type="dxa" w:w="1680"/>
-          </w:tcPr>
-          <w:p>
-            <w:r>
-              <w:t>AAP Won (+26)</w:t>
-            </w:r>
-          </w:p>
-        </w:tc>
-      </w:tr>
-      <w:tr>
-        <w:tc>
-          <w:tcPr>
-            <w:tcW w:type="dxa" w:w="1680"/>
-          </w:tcPr>
-          <w:p>
-            <w:r>
-              <w:t>#219</w:t>
-            </w:r>
-          </w:p>
-        </w:tc>
-        <w:tc>
-          <w:tcPr>
-            <w:tcW w:type="dxa" w:w="1680"/>
-          </w:tcPr>
-          <w:p>
-            <w:r>
-              <w:t>Jagdev Kalan</w:t>
-              <w:br/>
-              <w:t>(ਜਗਦੇਵ ਕਲਾਂ)</w:t>
-            </w:r>
-          </w:p>
-        </w:tc>
-        <w:tc>
-          <w:tcPr>
-            <w:tcW w:type="dxa" w:w="1680"/>
-          </w:tcPr>
-          <w:p>
-            <w:r>
-              <w:t>243</w:t>
-            </w:r>
-          </w:p>
-        </w:tc>
-        <w:tc>
-          <w:tcPr>
-            <w:tcW w:type="dxa" w:w="1680"/>
-          </w:tcPr>
-          <w:p>
-            <w:r>
-              <w:t>37.44%</w:t>
-            </w:r>
-          </w:p>
-        </w:tc>
-        <w:tc>
-          <w:tcPr>
-            <w:tcW w:type="dxa" w:w="1680"/>
-          </w:tcPr>
-          <w:p>
-            <w:r>
-              <w:t>+15 lead</w:t>
-            </w:r>
-          </w:p>
-        </w:tc>
-        <w:tc>
-          <w:tcPr>
-            <w:tcW w:type="dxa" w:w="1680"/>
-          </w:tcPr>
-          <w:p>
-            <w:r>
-              <w:t>AAP Won (+29)</w:t>
-            </w:r>
-          </w:p>
-        </w:tc>
-      </w:tr>
-      <w:tr>
-        <w:tc>
-          <w:tcPr>
-            <w:tcW w:type="dxa" w:w="1680"/>
-          </w:tcPr>
-          <w:p>
-            <w:r>
-              <w:t>#221</w:t>
-            </w:r>
-          </w:p>
-        </w:tc>
-        <w:tc>
-          <w:tcPr>
-            <w:tcW w:type="dxa" w:w="1680"/>
-          </w:tcPr>
-          <w:p>
-            <w:r>
-              <w:t>Jagdev Kalan</w:t>
-              <w:br/>
-              <w:t>(ਜਗਦੇਵ ਕਲਾਂ)</w:t>
-            </w:r>
-          </w:p>
-        </w:tc>
-        <w:tc>
-          <w:tcPr>
-            <w:tcW w:type="dxa" w:w="1680"/>
-          </w:tcPr>
-          <w:p>
-            <w:r>
-              <w:t>263</w:t>
-            </w:r>
-          </w:p>
-        </w:tc>
-        <w:tc>
-          <w:tcPr>
-            <w:tcW w:type="dxa" w:w="1680"/>
-          </w:tcPr>
-          <w:p>
-            <w:r>
-              <w:t>37.25%</w:t>
-            </w:r>
-          </w:p>
-        </w:tc>
-        <w:tc>
-          <w:tcPr>
-            <w:tcW w:type="dxa" w:w="1680"/>
-          </w:tcPr>
-          <w:p>
-            <w:r>
-              <w:t>+85 lead</w:t>
-            </w:r>
-          </w:p>
-        </w:tc>
-        <w:tc>
-          <w:tcPr>
-            <w:tcW w:type="dxa" w:w="1680"/>
-          </w:tcPr>
-          <w:p>
-            <w:r>
-              <w:t>AAP Won (+103)</w:t>
+              <w:t>SAD (+120)</w:t>
             </w:r>
           </w:p>
         </w:tc>
@@ -2052,7 +1587,7 @@
         <w:pStyle w:val="Heading2"/>
       </w:pPr>
       <w:r>
-        <w:t>4. AAP Top 15 Major Gains (Flipped to AAP in 2024)</w:t>
+        <w:t>Top 10 Vulnerable Booths (&lt; 20% AAP Vote Share)</w:t>
       </w:r>
     </w:p>
     <w:tbl>
@@ -2073,7 +1608,7 @@
         <w:tc>
           <w:tcPr>
             <w:tcW w:type="dxa" w:w="1680"/>
-            <w:shd w:fill="0284C7"/>
+            <w:shd w:fill="9C0006"/>
           </w:tcPr>
           <w:p>
             <w:r>
@@ -2088,7 +1623,7 @@
         <w:tc>
           <w:tcPr>
             <w:tcW w:type="dxa" w:w="1680"/>
-            <w:shd w:fill="0284C7"/>
+            <w:shd w:fill="9C0006"/>
           </w:tcPr>
           <w:p>
             <w:r>
@@ -2096,14 +1631,14 @@
                 <w:b/>
                 <w:color w:val="FFFFFF"/>
               </w:rPr>
-              <w:t>Village / Polling Station</w:t>
+              <w:t>Village Name</w:t>
             </w:r>
           </w:p>
         </w:tc>
         <w:tc>
           <w:tcPr>
             <w:tcW w:type="dxa" w:w="1680"/>
-            <w:shd w:fill="0284C7"/>
+            <w:shd w:fill="9C0006"/>
           </w:tcPr>
           <w:p>
             <w:r>
@@ -2118,7 +1653,7 @@
         <w:tc>
           <w:tcPr>
             <w:tcW w:type="dxa" w:w="1680"/>
-            <w:shd w:fill="0284C7"/>
+            <w:shd w:fill="9C0006"/>
           </w:tcPr>
           <w:p>
             <w:r>
@@ -2126,1094 +1661,14 @@
                 <w:b/>
                 <w:color w:val="FFFFFF"/>
               </w:rPr>
-              <w:t>AAP Swing %</w:t>
+              <w:t>2024 AAP %</w:t>
             </w:r>
           </w:p>
         </w:tc>
         <w:tc>
           <w:tcPr>
             <w:tcW w:type="dxa" w:w="1680"/>
-            <w:shd w:fill="0284C7"/>
-          </w:tcPr>
-          <w:p>
-            <w:r>
-              <w:rPr>
-                <w:b/>
-                <w:color w:val="FFFFFF"/>
-              </w:rPr>
-              <w:t>2024 Lead</w:t>
-            </w:r>
-          </w:p>
-        </w:tc>
-        <w:tc>
-          <w:tcPr>
-            <w:tcW w:type="dxa" w:w="1680"/>
-            <w:shd w:fill="0284C7"/>
-          </w:tcPr>
-          <w:p>
-            <w:r>
-              <w:rPr>
-                <w:b/>
-                <w:color w:val="FFFFFF"/>
-              </w:rPr>
-              <w:t>Flipped From (2022)</w:t>
-            </w:r>
-          </w:p>
-        </w:tc>
-      </w:tr>
-      <w:tr>
-        <w:tc>
-          <w:tcPr>
-            <w:tcW w:type="dxa" w:w="1680"/>
-          </w:tcPr>
-          <w:p>
-            <w:r>
-              <w:t>#192</w:t>
-            </w:r>
-          </w:p>
-        </w:tc>
-        <w:tc>
-          <w:tcPr>
-            <w:tcW w:type="dxa" w:w="1680"/>
-          </w:tcPr>
-          <w:p>
-            <w:r>
-              <w:t>Jhojeti</w:t>
-              <w:br/>
-              <w:t>(ਝੋਜੇਟੀ)</w:t>
-            </w:r>
-          </w:p>
-        </w:tc>
-        <w:tc>
-          <w:tcPr>
-            <w:tcW w:type="dxa" w:w="1680"/>
-          </w:tcPr>
-          <w:p>
-            <w:r>
-              <w:t>348</w:t>
-            </w:r>
-          </w:p>
-        </w:tc>
-        <w:tc>
-          <w:tcPr>
-            <w:tcW w:type="dxa" w:w="1680"/>
-          </w:tcPr>
-          <w:p>
-            <w:r>
-              <w:t>+60.17%</w:t>
-            </w:r>
-          </w:p>
-        </w:tc>
-        <w:tc>
-          <w:tcPr>
-            <w:tcW w:type="dxa" w:w="1680"/>
-          </w:tcPr>
-          <w:p>
-            <w:r>
-              <w:t>+256 lead</w:t>
-            </w:r>
-          </w:p>
-        </w:tc>
-        <w:tc>
-          <w:tcPr>
-            <w:tcW w:type="dxa" w:w="1680"/>
-          </w:tcPr>
-          <w:p>
-            <w:r>
-              <w:t>INC (+200)</w:t>
-            </w:r>
-          </w:p>
-        </w:tc>
-      </w:tr>
-      <w:tr>
-        <w:tc>
-          <w:tcPr>
-            <w:tcW w:type="dxa" w:w="1680"/>
-          </w:tcPr>
-          <w:p>
-            <w:r>
-              <w:t>#193</w:t>
-            </w:r>
-          </w:p>
-        </w:tc>
-        <w:tc>
-          <w:tcPr>
-            <w:tcW w:type="dxa" w:w="1680"/>
-          </w:tcPr>
-          <w:p>
-            <w:r>
-              <w:t>Jhanjoti</w:t>
-              <w:br/>
-              <w:t>(ਝੰਜੋਟੀ)</w:t>
-            </w:r>
-          </w:p>
-        </w:tc>
-        <w:tc>
-          <w:tcPr>
-            <w:tcW w:type="dxa" w:w="1680"/>
-          </w:tcPr>
-          <w:p>
-            <w:r>
-              <w:t>309</w:t>
-            </w:r>
-          </w:p>
-        </w:tc>
-        <w:tc>
-          <w:tcPr>
-            <w:tcW w:type="dxa" w:w="1680"/>
-          </w:tcPr>
-          <w:p>
-            <w:r>
-              <w:t>+52.98%</w:t>
-            </w:r>
-          </w:p>
-        </w:tc>
-        <w:tc>
-          <w:tcPr>
-            <w:tcW w:type="dxa" w:w="1680"/>
-          </w:tcPr>
-          <w:p>
-            <w:r>
-              <w:t>+193 lead</w:t>
-            </w:r>
-          </w:p>
-        </w:tc>
-        <w:tc>
-          <w:tcPr>
-            <w:tcW w:type="dxa" w:w="1680"/>
-          </w:tcPr>
-          <w:p>
-            <w:r>
-              <w:t>INC (+25)</w:t>
-            </w:r>
-          </w:p>
-        </w:tc>
-      </w:tr>
-      <w:tr>
-        <w:tc>
-          <w:tcPr>
-            <w:tcW w:type="dxa" w:w="1680"/>
-          </w:tcPr>
-          <w:p>
-            <w:r>
-              <w:t>#87</w:t>
-            </w:r>
-          </w:p>
-        </w:tc>
-        <w:tc>
-          <w:tcPr>
-            <w:tcW w:type="dxa" w:w="1680"/>
-          </w:tcPr>
-          <w:p>
-            <w:r>
-              <w:t>Kotli Koretana</w:t>
-              <w:br/>
-              <w:t>(ਕੋਟਲੀ ਕੋਰੇਟਾਨਾ)</w:t>
-            </w:r>
-          </w:p>
-        </w:tc>
-        <w:tc>
-          <w:tcPr>
-            <w:tcW w:type="dxa" w:w="1680"/>
-          </w:tcPr>
-          <w:p>
-            <w:r>
-              <w:t>359</w:t>
-            </w:r>
-          </w:p>
-        </w:tc>
-        <w:tc>
-          <w:tcPr>
-            <w:tcW w:type="dxa" w:w="1680"/>
-          </w:tcPr>
-          <w:p>
-            <w:r>
-              <w:t>+43.99%</w:t>
-            </w:r>
-          </w:p>
-        </w:tc>
-        <w:tc>
-          <w:tcPr>
-            <w:tcW w:type="dxa" w:w="1680"/>
-          </w:tcPr>
-          <w:p>
-            <w:r>
-              <w:t>+295 lead</w:t>
-            </w:r>
-          </w:p>
-        </w:tc>
-        <w:tc>
-          <w:tcPr>
-            <w:tcW w:type="dxa" w:w="1680"/>
-          </w:tcPr>
-          <w:p>
-            <w:r>
-              <w:t>INC (+82)</w:t>
-            </w:r>
-          </w:p>
-        </w:tc>
-      </w:tr>
-      <w:tr>
-        <w:tc>
-          <w:tcPr>
-            <w:tcW w:type="dxa" w:w="1680"/>
-          </w:tcPr>
-          <w:p>
-            <w:r>
-              <w:t>#172</w:t>
-            </w:r>
-          </w:p>
-        </w:tc>
-        <w:tc>
-          <w:tcPr>
-            <w:tcW w:type="dxa" w:w="1680"/>
-          </w:tcPr>
-          <w:p>
-            <w:r>
-              <w:t>Kohali</w:t>
-              <w:br/>
-              <w:t>(ਕੋਹਾਲੀ)</w:t>
-            </w:r>
-          </w:p>
-        </w:tc>
-        <w:tc>
-          <w:tcPr>
-            <w:tcW w:type="dxa" w:w="1680"/>
-          </w:tcPr>
-          <w:p>
-            <w:r>
-              <w:t>285</w:t>
-            </w:r>
-          </w:p>
-        </w:tc>
-        <w:tc>
-          <w:tcPr>
-            <w:tcW w:type="dxa" w:w="1680"/>
-          </w:tcPr>
-          <w:p>
-            <w:r>
-              <w:t>+33.69%</w:t>
-            </w:r>
-          </w:p>
-        </w:tc>
-        <w:tc>
-          <w:tcPr>
-            <w:tcW w:type="dxa" w:w="1680"/>
-          </w:tcPr>
-          <w:p>
-            <w:r>
-              <w:t>+164 lead</w:t>
-            </w:r>
-          </w:p>
-        </w:tc>
-        <w:tc>
-          <w:tcPr>
-            <w:tcW w:type="dxa" w:w="1680"/>
-          </w:tcPr>
-          <w:p>
-            <w:r>
-              <w:t>INC (+92)</w:t>
-            </w:r>
-          </w:p>
-        </w:tc>
-      </w:tr>
-      <w:tr>
-        <w:tc>
-          <w:tcPr>
-            <w:tcW w:type="dxa" w:w="1680"/>
-          </w:tcPr>
-          <w:p>
-            <w:r>
-              <w:t>#158</w:t>
-            </w:r>
-          </w:p>
-        </w:tc>
-        <w:tc>
-          <w:tcPr>
-            <w:tcW w:type="dxa" w:w="1680"/>
-          </w:tcPr>
-          <w:p>
-            <w:r>
-              <w:t>Brar</w:t>
-              <w:br/>
-              <w:t>(ਬਰਾੜ)</w:t>
-            </w:r>
-          </w:p>
-        </w:tc>
-        <w:tc>
-          <w:tcPr>
-            <w:tcW w:type="dxa" w:w="1680"/>
-          </w:tcPr>
-          <w:p>
-            <w:r>
-              <w:t>237</w:t>
-            </w:r>
-          </w:p>
-        </w:tc>
-        <w:tc>
-          <w:tcPr>
-            <w:tcW w:type="dxa" w:w="1680"/>
-          </w:tcPr>
-          <w:p>
-            <w:r>
-              <w:t>+33.39%</w:t>
-            </w:r>
-          </w:p>
-        </w:tc>
-        <w:tc>
-          <w:tcPr>
-            <w:tcW w:type="dxa" w:w="1680"/>
-          </w:tcPr>
-          <w:p>
-            <w:r>
-              <w:t>+83 lead</w:t>
-            </w:r>
-          </w:p>
-        </w:tc>
-        <w:tc>
-          <w:tcPr>
-            <w:tcW w:type="dxa" w:w="1680"/>
-          </w:tcPr>
-          <w:p>
-            <w:r>
-              <w:t>INC (+182)</w:t>
-            </w:r>
-          </w:p>
-        </w:tc>
-      </w:tr>
-      <w:tr>
-        <w:tc>
-          <w:tcPr>
-            <w:tcW w:type="dxa" w:w="1680"/>
-          </w:tcPr>
-          <w:p>
-            <w:r>
-              <w:t>#135</w:t>
-            </w:r>
-          </w:p>
-        </w:tc>
-        <w:tc>
-          <w:tcPr>
-            <w:tcW w:type="dxa" w:w="1680"/>
-          </w:tcPr>
-          <w:p>
-            <w:r>
-              <w:t>Shahura</w:t>
-              <w:br/>
-              <w:t>(ਸ਼ਹੂਰਾ)</w:t>
-            </w:r>
-          </w:p>
-        </w:tc>
-        <w:tc>
-          <w:tcPr>
-            <w:tcW w:type="dxa" w:w="1680"/>
-          </w:tcPr>
-          <w:p>
-            <w:r>
-              <w:t>145</w:t>
-            </w:r>
-          </w:p>
-        </w:tc>
-        <w:tc>
-          <w:tcPr>
-            <w:tcW w:type="dxa" w:w="1680"/>
-          </w:tcPr>
-          <w:p>
-            <w:r>
-              <w:t>+31.41%</w:t>
-            </w:r>
-          </w:p>
-        </w:tc>
-        <w:tc>
-          <w:tcPr>
-            <w:tcW w:type="dxa" w:w="1680"/>
-          </w:tcPr>
-          <w:p>
-            <w:r>
-              <w:t>+41 lead</w:t>
-            </w:r>
-          </w:p>
-        </w:tc>
-        <w:tc>
-          <w:tcPr>
-            <w:tcW w:type="dxa" w:w="1680"/>
-          </w:tcPr>
-          <w:p>
-            <w:r>
-              <w:t>INC (+40)</w:t>
-            </w:r>
-          </w:p>
-        </w:tc>
-      </w:tr>
-      <w:tr>
-        <w:tc>
-          <w:tcPr>
-            <w:tcW w:type="dxa" w:w="1680"/>
-          </w:tcPr>
-          <w:p>
-            <w:r>
-              <w:t>#68</w:t>
-            </w:r>
-          </w:p>
-        </w:tc>
-        <w:tc>
-          <w:tcPr>
-            <w:tcW w:type="dxa" w:w="1680"/>
-          </w:tcPr>
-          <w:p>
-            <w:r>
-              <w:t>Bhilewal Kakeji</w:t>
-              <w:br/>
-              <w:t>(ਭੀਲੇਵਾਲ ਕਕੇਜੀ)</w:t>
-            </w:r>
-          </w:p>
-        </w:tc>
-        <w:tc>
-          <w:tcPr>
-            <w:tcW w:type="dxa" w:w="1680"/>
-          </w:tcPr>
-          <w:p>
-            <w:r>
-              <w:t>206</w:t>
-            </w:r>
-          </w:p>
-        </w:tc>
-        <w:tc>
-          <w:tcPr>
-            <w:tcW w:type="dxa" w:w="1680"/>
-          </w:tcPr>
-          <w:p>
-            <w:r>
-              <w:t>+29.68%</w:t>
-            </w:r>
-          </w:p>
-        </w:tc>
-        <w:tc>
-          <w:tcPr>
-            <w:tcW w:type="dxa" w:w="1680"/>
-          </w:tcPr>
-          <w:p>
-            <w:r>
-              <w:t>+156 lead</w:t>
-            </w:r>
-          </w:p>
-        </w:tc>
-        <w:tc>
-          <w:tcPr>
-            <w:tcW w:type="dxa" w:w="1680"/>
-          </w:tcPr>
-          <w:p>
-            <w:r>
-              <w:t>INC (+2)</w:t>
-            </w:r>
-          </w:p>
-        </w:tc>
-      </w:tr>
-      <w:tr>
-        <w:tc>
-          <w:tcPr>
-            <w:tcW w:type="dxa" w:w="1680"/>
-          </w:tcPr>
-          <w:p>
-            <w:r>
-              <w:t>#160</w:t>
-            </w:r>
-          </w:p>
-        </w:tc>
-        <w:tc>
-          <w:tcPr>
-            <w:tcW w:type="dxa" w:w="1680"/>
-          </w:tcPr>
-          <w:p>
-            <w:r>
-              <w:t>Madeke</w:t>
-              <w:br/>
-              <w:t>(ਮਾਦੇਕੇ)</w:t>
-            </w:r>
-          </w:p>
-        </w:tc>
-        <w:tc>
-          <w:tcPr>
-            <w:tcW w:type="dxa" w:w="1680"/>
-          </w:tcPr>
-          <w:p>
-            <w:r>
-              <w:t>272</w:t>
-            </w:r>
-          </w:p>
-        </w:tc>
-        <w:tc>
-          <w:tcPr>
-            <w:tcW w:type="dxa" w:w="1680"/>
-          </w:tcPr>
-          <w:p>
-            <w:r>
-              <w:t>+25.42%</w:t>
-            </w:r>
-          </w:p>
-        </w:tc>
-        <w:tc>
-          <w:tcPr>
-            <w:tcW w:type="dxa" w:w="1680"/>
-          </w:tcPr>
-          <w:p>
-            <w:r>
-              <w:t>+106 lead</w:t>
-            </w:r>
-          </w:p>
-        </w:tc>
-        <w:tc>
-          <w:tcPr>
-            <w:tcW w:type="dxa" w:w="1680"/>
-          </w:tcPr>
-          <w:p>
-            <w:r>
-              <w:t>INC (+148)</w:t>
-            </w:r>
-          </w:p>
-        </w:tc>
-      </w:tr>
-      <w:tr>
-        <w:tc>
-          <w:tcPr>
-            <w:tcW w:type="dxa" w:w="1680"/>
-          </w:tcPr>
-          <w:p>
-            <w:r>
-              <w:t>#216</w:t>
-            </w:r>
-          </w:p>
-        </w:tc>
-        <w:tc>
-          <w:tcPr>
-            <w:tcW w:type="dxa" w:w="1680"/>
-          </w:tcPr>
-          <w:p>
-            <w:r>
-              <w:t>Ladeh</w:t>
-              <w:br/>
-              <w:t>(ਲਦੇਹ)</w:t>
-            </w:r>
-          </w:p>
-        </w:tc>
-        <w:tc>
-          <w:tcPr>
-            <w:tcW w:type="dxa" w:w="1680"/>
-          </w:tcPr>
-          <w:p>
-            <w:r>
-              <w:t>321</w:t>
-            </w:r>
-          </w:p>
-        </w:tc>
-        <w:tc>
-          <w:tcPr>
-            <w:tcW w:type="dxa" w:w="1680"/>
-          </w:tcPr>
-          <w:p>
-            <w:r>
-              <w:t>+24.48%</w:t>
-            </w:r>
-          </w:p>
-        </w:tc>
-        <w:tc>
-          <w:tcPr>
-            <w:tcW w:type="dxa" w:w="1680"/>
-          </w:tcPr>
-          <w:p>
-            <w:r>
-              <w:t>+233 lead</w:t>
-            </w:r>
-          </w:p>
-        </w:tc>
-        <w:tc>
-          <w:tcPr>
-            <w:tcW w:type="dxa" w:w="1680"/>
-          </w:tcPr>
-          <w:p>
-            <w:r>
-              <w:t>INC (+73)</w:t>
-            </w:r>
-          </w:p>
-        </w:tc>
-      </w:tr>
-      <w:tr>
-        <w:tc>
-          <w:tcPr>
-            <w:tcW w:type="dxa" w:w="1680"/>
-          </w:tcPr>
-          <w:p>
-            <w:r>
-              <w:t>#173</w:t>
-            </w:r>
-          </w:p>
-        </w:tc>
-        <w:tc>
-          <w:tcPr>
-            <w:tcW w:type="dxa" w:w="1680"/>
-          </w:tcPr>
-          <w:p>
-            <w:r>
-              <w:t>Kohali + Rakh Kohali</w:t>
-              <w:br/>
-              <w:t>(ਕੋਹਾਲੀ + ਰੱਖ ਕੋਹਾਲੀ)</w:t>
-            </w:r>
-          </w:p>
-        </w:tc>
-        <w:tc>
-          <w:tcPr>
-            <w:tcW w:type="dxa" w:w="1680"/>
-          </w:tcPr>
-          <w:p>
-            <w:r>
-              <w:t>198</w:t>
-            </w:r>
-          </w:p>
-        </w:tc>
-        <w:tc>
-          <w:tcPr>
-            <w:tcW w:type="dxa" w:w="1680"/>
-          </w:tcPr>
-          <w:p>
-            <w:r>
-              <w:t>+22.76%</w:t>
-            </w:r>
-          </w:p>
-        </w:tc>
-        <w:tc>
-          <w:tcPr>
-            <w:tcW w:type="dxa" w:w="1680"/>
-          </w:tcPr>
-          <w:p>
-            <w:r>
-              <w:t>+110 lead</w:t>
-            </w:r>
-          </w:p>
-        </w:tc>
-        <w:tc>
-          <w:tcPr>
-            <w:tcW w:type="dxa" w:w="1680"/>
-          </w:tcPr>
-          <w:p>
-            <w:r>
-              <w:t>INC (+183)</w:t>
-            </w:r>
-          </w:p>
-        </w:tc>
-      </w:tr>
-      <w:tr>
-        <w:tc>
-          <w:tcPr>
-            <w:tcW w:type="dxa" w:w="1680"/>
-          </w:tcPr>
-          <w:p>
-            <w:r>
-              <w:t>#180</w:t>
-            </w:r>
-          </w:p>
-        </w:tc>
-        <w:tc>
-          <w:tcPr>
-            <w:tcW w:type="dxa" w:w="1680"/>
-          </w:tcPr>
-          <w:p>
-            <w:r>
-              <w:t>Dhariwal</w:t>
-              <w:br/>
-              <w:t>(ਧਾਰੀਵਾਲ)</w:t>
-            </w:r>
-          </w:p>
-        </w:tc>
-        <w:tc>
-          <w:tcPr>
-            <w:tcW w:type="dxa" w:w="1680"/>
-          </w:tcPr>
-          <w:p>
-            <w:r>
-              <w:t>194</w:t>
-            </w:r>
-          </w:p>
-        </w:tc>
-        <w:tc>
-          <w:tcPr>
-            <w:tcW w:type="dxa" w:w="1680"/>
-          </w:tcPr>
-          <w:p>
-            <w:r>
-              <w:t>+22.42%</w:t>
-            </w:r>
-          </w:p>
-        </w:tc>
-        <w:tc>
-          <w:tcPr>
-            <w:tcW w:type="dxa" w:w="1680"/>
-          </w:tcPr>
-          <w:p>
-            <w:r>
-              <w:t>+22 lead</w:t>
-            </w:r>
-          </w:p>
-        </w:tc>
-        <w:tc>
-          <w:tcPr>
-            <w:tcW w:type="dxa" w:w="1680"/>
-          </w:tcPr>
-          <w:p>
-            <w:r>
-              <w:t>INC (+82)</w:t>
-            </w:r>
-          </w:p>
-        </w:tc>
-      </w:tr>
-      <w:tr>
-        <w:tc>
-          <w:tcPr>
-            <w:tcW w:type="dxa" w:w="1680"/>
-          </w:tcPr>
-          <w:p>
-            <w:r>
-              <w:t>#178</w:t>
-            </w:r>
-          </w:p>
-        </w:tc>
-        <w:tc>
-          <w:tcPr>
-            <w:tcW w:type="dxa" w:w="1680"/>
-          </w:tcPr>
-          <w:p>
-            <w:r>
-              <w:t>Bagga Kalan</w:t>
-              <w:br/>
-              <w:t>(ਬੱਗਾ ਕਲਾਂ)</w:t>
-            </w:r>
-          </w:p>
-        </w:tc>
-        <w:tc>
-          <w:tcPr>
-            <w:tcW w:type="dxa" w:w="1680"/>
-          </w:tcPr>
-          <w:p>
-            <w:r>
-              <w:t>156</w:t>
-            </w:r>
-          </w:p>
-        </w:tc>
-        <w:tc>
-          <w:tcPr>
-            <w:tcW w:type="dxa" w:w="1680"/>
-          </w:tcPr>
-          <w:p>
-            <w:r>
-              <w:t>+22.38%</w:t>
-            </w:r>
-          </w:p>
-        </w:tc>
-        <w:tc>
-          <w:tcPr>
-            <w:tcW w:type="dxa" w:w="1680"/>
-          </w:tcPr>
-          <w:p>
-            <w:r>
-              <w:t>+44 lead</w:t>
-            </w:r>
-          </w:p>
-        </w:tc>
-        <w:tc>
-          <w:tcPr>
-            <w:tcW w:type="dxa" w:w="1680"/>
-          </w:tcPr>
-          <w:p>
-            <w:r>
-              <w:t>INC (+33)</w:t>
-            </w:r>
-          </w:p>
-        </w:tc>
-      </w:tr>
-      <w:tr>
-        <w:tc>
-          <w:tcPr>
-            <w:tcW w:type="dxa" w:w="1680"/>
-          </w:tcPr>
-          <w:p>
-            <w:r>
-              <w:t>#182</w:t>
-            </w:r>
-          </w:p>
-        </w:tc>
-        <w:tc>
-          <w:tcPr>
-            <w:tcW w:type="dxa" w:w="1680"/>
-          </w:tcPr>
-          <w:p>
-            <w:r>
-              <w:t>Harsha Chhina (Abadi Ucha Kila)</w:t>
-              <w:br/>
-              <w:t>(ਹਰਸ਼ਾ ਛੀਨਾ (ਅਬਾਦੀ ਉੱਚਾ ਕਿਲਾ))</w:t>
-            </w:r>
-          </w:p>
-        </w:tc>
-        <w:tc>
-          <w:tcPr>
-            <w:tcW w:type="dxa" w:w="1680"/>
-          </w:tcPr>
-          <w:p>
-            <w:r>
-              <w:t>240</w:t>
-            </w:r>
-          </w:p>
-        </w:tc>
-        <w:tc>
-          <w:tcPr>
-            <w:tcW w:type="dxa" w:w="1680"/>
-          </w:tcPr>
-          <w:p>
-            <w:r>
-              <w:t>+19.36%</w:t>
-            </w:r>
-          </w:p>
-        </w:tc>
-        <w:tc>
-          <w:tcPr>
-            <w:tcW w:type="dxa" w:w="1680"/>
-          </w:tcPr>
-          <w:p>
-            <w:r>
-              <w:t>+67 lead</w:t>
-            </w:r>
-          </w:p>
-        </w:tc>
-        <w:tc>
-          <w:tcPr>
-            <w:tcW w:type="dxa" w:w="1680"/>
-          </w:tcPr>
-          <w:p>
-            <w:r>
-              <w:t>SAD (+58)</w:t>
-            </w:r>
-          </w:p>
-        </w:tc>
-      </w:tr>
-      <w:tr>
-        <w:tc>
-          <w:tcPr>
-            <w:tcW w:type="dxa" w:w="1680"/>
-          </w:tcPr>
-          <w:p>
-            <w:r>
-              <w:t>#75</w:t>
-            </w:r>
-          </w:p>
-        </w:tc>
-        <w:tc>
-          <w:tcPr>
-            <w:tcW w:type="dxa" w:w="1680"/>
-          </w:tcPr>
-          <w:p>
-            <w:r>
-              <w:t>Khushpura + Hasanpura</w:t>
-              <w:br/>
-              <w:t>(ਖੁਸ਼ਪੁਰਾ + ਹਸਨਪੁਰਾ)</w:t>
-            </w:r>
-          </w:p>
-        </w:tc>
-        <w:tc>
-          <w:tcPr>
-            <w:tcW w:type="dxa" w:w="1680"/>
-          </w:tcPr>
-          <w:p>
-            <w:r>
-              <w:t>161</w:t>
-            </w:r>
-          </w:p>
-        </w:tc>
-        <w:tc>
-          <w:tcPr>
-            <w:tcW w:type="dxa" w:w="1680"/>
-          </w:tcPr>
-          <w:p>
-            <w:r>
-              <w:t>+18.98%</w:t>
-            </w:r>
-          </w:p>
-        </w:tc>
-        <w:tc>
-          <w:tcPr>
-            <w:tcW w:type="dxa" w:w="1680"/>
-          </w:tcPr>
-          <w:p>
-            <w:r>
-              <w:t>+55 lead</w:t>
-            </w:r>
-          </w:p>
-        </w:tc>
-        <w:tc>
-          <w:tcPr>
-            <w:tcW w:type="dxa" w:w="1680"/>
-          </w:tcPr>
-          <w:p>
-            <w:r>
-              <w:t>SAD (+73)</w:t>
-            </w:r>
-          </w:p>
-        </w:tc>
-      </w:tr>
-      <w:tr>
-        <w:tc>
-          <w:tcPr>
-            <w:tcW w:type="dxa" w:w="1680"/>
-          </w:tcPr>
-          <w:p>
-            <w:r>
-              <w:t>#65</w:t>
-            </w:r>
-          </w:p>
-        </w:tc>
-        <w:tc>
-          <w:tcPr>
-            <w:tcW w:type="dxa" w:w="1680"/>
-          </w:tcPr>
-          <w:p>
-            <w:r>
-              <w:t>Lepoke</w:t>
-              <w:br/>
-              <w:t>(ਲੇਪੋਕੇ)</w:t>
-            </w:r>
-          </w:p>
-        </w:tc>
-        <w:tc>
-          <w:tcPr>
-            <w:tcW w:type="dxa" w:w="1680"/>
-          </w:tcPr>
-          <w:p>
-            <w:r>
-              <w:t>188</w:t>
-            </w:r>
-          </w:p>
-        </w:tc>
-        <w:tc>
-          <w:tcPr>
-            <w:tcW w:type="dxa" w:w="1680"/>
-          </w:tcPr>
-          <w:p>
-            <w:r>
-              <w:t>+18.95%</w:t>
-            </w:r>
-          </w:p>
-        </w:tc>
-        <w:tc>
-          <w:tcPr>
-            <w:tcW w:type="dxa" w:w="1680"/>
-          </w:tcPr>
-          <w:p>
-            <w:r>
-              <w:t>+15 lead</w:t>
-            </w:r>
-          </w:p>
-        </w:tc>
-        <w:tc>
-          <w:tcPr>
-            <w:tcW w:type="dxa" w:w="1680"/>
-          </w:tcPr>
-          <w:p>
-            <w:r>
-              <w:t>INC (+34)</w:t>
-            </w:r>
-          </w:p>
-        </w:tc>
-      </w:tr>
-    </w:tbl>
-    <w:p>
-      <w:pPr>
-        <w:spacing w:after="240"/>
-      </w:pPr>
-    </w:p>
-    <w:p>
-      <w:pPr>
-        <w:pStyle w:val="Heading2"/>
-      </w:pPr>
-      <w:r>
-        <w:t>5. AAP Top 15 Losses (Won in 2022, Lost in 2024)</w:t>
-      </w:r>
-    </w:p>
-    <w:tbl>
-      <w:tblPr>
-        <w:tblW w:type="auto" w:w="0"/>
-        <w:jc w:val="center"/>
-        <w:tblLook w:firstColumn="1" w:firstRow="1" w:lastColumn="0" w:lastRow="0" w:noHBand="0" w:noVBand="1" w:val="04A0"/>
-      </w:tblPr>
-      <w:tblGrid>
-        <w:gridCol w:w="1680"/>
-        <w:gridCol w:w="1680"/>
-        <w:gridCol w:w="1680"/>
-        <w:gridCol w:w="1680"/>
-        <w:gridCol w:w="1680"/>
-        <w:gridCol w:w="1680"/>
-      </w:tblGrid>
-      <w:tr>
-        <w:tc>
-          <w:tcPr>
-            <w:tcW w:type="dxa" w:w="1680"/>
-            <w:shd w:fill="DC2626"/>
-          </w:tcPr>
-          <w:p>
-            <w:r>
-              <w:rPr>
-                <w:b/>
-                <w:color w:val="FFFFFF"/>
-              </w:rPr>
-              <w:t>Booth</w:t>
-            </w:r>
-          </w:p>
-        </w:tc>
-        <w:tc>
-          <w:tcPr>
-            <w:tcW w:type="dxa" w:w="1680"/>
-            <w:shd w:fill="DC2626"/>
-          </w:tcPr>
-          <w:p>
-            <w:r>
-              <w:rPr>
-                <w:b/>
-                <w:color w:val="FFFFFF"/>
-              </w:rPr>
-              <w:t>Village / Polling Station</w:t>
-            </w:r>
-          </w:p>
-        </w:tc>
-        <w:tc>
-          <w:tcPr>
-            <w:tcW w:type="dxa" w:w="1680"/>
-            <w:shd w:fill="DC2626"/>
-          </w:tcPr>
-          <w:p>
-            <w:r>
-              <w:rPr>
-                <w:b/>
-                <w:color w:val="FFFFFF"/>
-              </w:rPr>
-              <w:t>2024 AAP Votes</w:t>
-            </w:r>
-          </w:p>
-        </w:tc>
-        <w:tc>
-          <w:tcPr>
-            <w:tcW w:type="dxa" w:w="1680"/>
-            <w:shd w:fill="DC2626"/>
-          </w:tcPr>
-          <w:p>
-            <w:r>
-              <w:rPr>
-                <w:b/>
-                <w:color w:val="FFFFFF"/>
-              </w:rPr>
-              <w:t>AAP Swing %</w:t>
-            </w:r>
-          </w:p>
-        </w:tc>
-        <w:tc>
-          <w:tcPr>
-            <w:tcW w:type="dxa" w:w="1680"/>
-            <w:shd w:fill="DC2626"/>
+            <w:shd w:fill="9C0006"/>
           </w:tcPr>
           <w:p>
             <w:r>
@@ -3228,7 +1683,7 @@
         <w:tc>
           <w:tcPr>
             <w:tcW w:type="dxa" w:w="1680"/>
-            <w:shd w:fill="DC2626"/>
+            <w:shd w:fill="9C0006"/>
           </w:tcPr>
           <w:p>
             <w:r>
@@ -3236,7 +1691,7 @@
                 <w:b/>
                 <w:color w:val="FFFFFF"/>
               </w:rPr>
-              <w:t>Deficit Margin</w:t>
+              <w:t>Deficit</w:t>
             </w:r>
           </w:p>
         </w:tc>
@@ -3248,7 +1703,7 @@
           </w:tcPr>
           <w:p>
             <w:r>
-              <w:t>#165</w:t>
+              <w:t>#110</w:t>
             </w:r>
           </w:p>
         </w:tc>
@@ -3258,9 +1713,7 @@
           </w:tcPr>
           <w:p>
             <w:r>
-              <w:t>Bopa Rai Baj Singh</w:t>
-              <w:br/>
-              <w:t>(ਬੋਪਾ ਰਾਏ ਬਾਜ ਸਿੰਘ)</w:t>
+              <w:t>Manawala</w:t>
             </w:r>
           </w:p>
         </w:tc>
@@ -3270,7 +1723,7 @@
           </w:tcPr>
           <w:p>
             <w:r>
-              <w:t>49</w:t>
+              <w:t>17</w:t>
             </w:r>
           </w:p>
         </w:tc>
@@ -3280,7 +1733,7 @@
           </w:tcPr>
           <w:p>
             <w:r>
-              <w:t>-31.5%</w:t>
+              <w:t>3.59%</w:t>
             </w:r>
           </w:p>
         </w:tc>
@@ -3290,7 +1743,7 @@
           </w:tcPr>
           <w:p>
             <w:r>
-              <w:t>INC Won</w:t>
+              <w:t>SAD</w:t>
             </w:r>
           </w:p>
         </w:tc>
@@ -3300,7 +1753,7 @@
           </w:tcPr>
           <w:p>
             <w:r>
-              <w:t>-192 deficit</w:t>
+              <w:t>-57 deficit</w:t>
             </w:r>
           </w:p>
         </w:tc>
@@ -3312,7 +1765,7 @@
           </w:tcPr>
           <w:p>
             <w:r>
-              <w:t>#166</w:t>
+              <w:t>#210</w:t>
             </w:r>
           </w:p>
         </w:tc>
@@ -3322,9 +1775,7 @@
           </w:tcPr>
           <w:p>
             <w:r>
-              <w:t>Kaler</w:t>
-              <w:br/>
-              <w:t>(ਕਲੇਰ)</w:t>
+              <w:t>Ward No 4 Navi Colony Sahamne Airport Rajasansi + Ward No 4 Ajnala Road Airport Colony Rajasansi + Ward No 4 Ajnala Road Airport Colony Rajasansi</w:t>
             </w:r>
           </w:p>
         </w:tc>
@@ -3334,7 +1785,7 @@
           </w:tcPr>
           <w:p>
             <w:r>
-              <w:t>67</w:t>
+              <w:t>20</w:t>
             </w:r>
           </w:p>
         </w:tc>
@@ -3344,7 +1795,7 @@
           </w:tcPr>
           <w:p>
             <w:r>
-              <w:t>-29.09%</w:t>
+              <w:t>4.57%</w:t>
             </w:r>
           </w:p>
         </w:tc>
@@ -3354,7 +1805,7 @@
           </w:tcPr>
           <w:p>
             <w:r>
-              <w:t>INC Won</w:t>
+              <w:t>SAD</w:t>
             </w:r>
           </w:p>
         </w:tc>
@@ -3364,7 +1815,7 @@
           </w:tcPr>
           <w:p>
             <w:r>
-              <w:t>-164 deficit</w:t>
+              <w:t>-291 deficit</w:t>
             </w:r>
           </w:p>
         </w:tc>
@@ -3376,7 +1827,7 @@
           </w:tcPr>
           <w:p>
             <w:r>
-              <w:t>#167</w:t>
+              <w:t>#37</w:t>
             </w:r>
           </w:p>
         </w:tc>
@@ -3386,9 +1837,7 @@
           </w:tcPr>
           <w:p>
             <w:r>
-              <w:t>Kaler</w:t>
-              <w:br/>
-              <w:t>(ਕਲੇਰ)</w:t>
+              <w:t>Chhann Kalan</w:t>
             </w:r>
           </w:p>
         </w:tc>
@@ -3398,7 +1847,7 @@
           </w:tcPr>
           <w:p>
             <w:r>
-              <w:t>110</w:t>
+              <w:t>48</w:t>
             </w:r>
           </w:p>
         </w:tc>
@@ -3408,7 +1857,7 @@
           </w:tcPr>
           <w:p>
             <w:r>
-              <w:t>-26.66%</w:t>
+              <w:t>6.41%</w:t>
             </w:r>
           </w:p>
         </w:tc>
@@ -3418,7 +1867,7 @@
           </w:tcPr>
           <w:p>
             <w:r>
-              <w:t>INC Won</w:t>
+              <w:t>INC</w:t>
             </w:r>
           </w:p>
         </w:tc>
@@ -3428,7 +1877,7 @@
           </w:tcPr>
           <w:p>
             <w:r>
-              <w:t>-136 deficit</w:t>
+              <w:t>-101 deficit</w:t>
             </w:r>
           </w:p>
         </w:tc>
@@ -3440,7 +1889,7 @@
           </w:tcPr>
           <w:p>
             <w:r>
-              <w:t>#164</w:t>
+              <w:t>#121</w:t>
             </w:r>
           </w:p>
         </w:tc>
@@ -3450,9 +1899,7 @@
           </w:tcPr>
           <w:p>
             <w:r>
-              <w:t>Bopa Rai Baj Singh</w:t>
-              <w:br/>
-              <w:t>(ਬੋਪਾ ਰਾਏ ਬਾਜ ਸਿੰਘ)</w:t>
+              <w:t>Tapiala</w:t>
             </w:r>
           </w:p>
         </w:tc>
@@ -3462,7 +1909,7 @@
           </w:tcPr>
           <w:p>
             <w:r>
-              <w:t>75</w:t>
+              <w:t>22</w:t>
             </w:r>
           </w:p>
         </w:tc>
@@ -3472,7 +1919,7 @@
           </w:tcPr>
           <w:p>
             <w:r>
-              <w:t>-25.53%</w:t>
+              <w:t>8.33%</w:t>
             </w:r>
           </w:p>
         </w:tc>
@@ -3482,7 +1929,7 @@
           </w:tcPr>
           <w:p>
             <w:r>
-              <w:t>INC Won</w:t>
+              <w:t>INC</w:t>
             </w:r>
           </w:p>
         </w:tc>
@@ -3492,7 +1939,7 @@
           </w:tcPr>
           <w:p>
             <w:r>
-              <w:t>-131 deficit</w:t>
+              <w:t>-65 deficit</w:t>
             </w:r>
           </w:p>
         </w:tc>
@@ -3504,7 +1951,7 @@
           </w:tcPr>
           <w:p>
             <w:r>
-              <w:t>#205</w:t>
+              <w:t>#115</w:t>
             </w:r>
           </w:p>
         </w:tc>
@@ -3514,9 +1961,7 @@
           </w:tcPr>
           <w:p>
             <w:r>
-              <w:t>Ward No. 10 Gali Sambh Wali + Ward No. 10 Gali Ghah Mandi + Ward No. 10 Gali Zaildara Wali</w:t>
-              <w:br/>
-              <w:t>(ਵਾਰਡ ਨੰ.10 ਗਲੀ ਸੰਭ ਵਾਲੀ + ਵਾਰਡ ਨੰ.10 ਗਲੀ ਘਾਹ ਮੰਡੀ + ਵਾਰਡ ਨੰ.10 ਗਲੀ ਜੈਲਦਾਰਾ ਵਾਲੀ)</w:t>
+              <w:t>Chogawan</w:t>
             </w:r>
           </w:p>
         </w:tc>
@@ -3526,7 +1971,7 @@
           </w:tcPr>
           <w:p>
             <w:r>
-              <w:t>78</w:t>
+              <w:t>37</w:t>
             </w:r>
           </w:p>
         </w:tc>
@@ -3536,7 +1981,7 @@
           </w:tcPr>
           <w:p>
             <w:r>
-              <w:t>-25.05%</w:t>
+              <w:t>9.09%</w:t>
             </w:r>
           </w:p>
         </w:tc>
@@ -3546,7 +1991,7 @@
           </w:tcPr>
           <w:p>
             <w:r>
-              <w:t>INC Won</w:t>
+              <w:t>INC</w:t>
             </w:r>
           </w:p>
         </w:tc>
@@ -3556,7 +2001,7 @@
           </w:tcPr>
           <w:p>
             <w:r>
-              <w:t>-58 deficit</w:t>
+              <w:t>-27 deficit</w:t>
             </w:r>
           </w:p>
         </w:tc>
@@ -3568,7 +2013,7 @@
           </w:tcPr>
           <w:p>
             <w:r>
-              <w:t>#8</w:t>
+              <w:t>#116</w:t>
             </w:r>
           </w:p>
         </w:tc>
@@ -3578,9 +2023,7 @@
           </w:tcPr>
           <w:p>
             <w:r>
-              <w:t>Bhindi Aulakh Kalan</w:t>
-              <w:br/>
-              <w:t>(ਭਿੰਡੀ ਅੌਲਖ ਕਲਾਂ)</w:t>
+              <w:t>Chogawan</w:t>
             </w:r>
           </w:p>
         </w:tc>
@@ -3590,7 +2033,7 @@
           </w:tcPr>
           <w:p>
             <w:r>
-              <w:t>130</w:t>
+              <w:t>34</w:t>
             </w:r>
           </w:p>
         </w:tc>
@@ -3600,7 +2043,7 @@
           </w:tcPr>
           <w:p>
             <w:r>
-              <w:t>-24.54%</w:t>
+              <w:t>9.26%</w:t>
             </w:r>
           </w:p>
         </w:tc>
@@ -3610,7 +2053,7 @@
           </w:tcPr>
           <w:p>
             <w:r>
-              <w:t>INC Won</w:t>
+              <w:t>INC</w:t>
             </w:r>
           </w:p>
         </w:tc>
@@ -3620,7 +2063,7 @@
           </w:tcPr>
           <w:p>
             <w:r>
-              <w:t>-159 deficit</w:t>
+              <w:t>-114 deficit</w:t>
             </w:r>
           </w:p>
         </w:tc>
@@ -3632,7 +2075,7 @@
           </w:tcPr>
           <w:p>
             <w:r>
-              <w:t>#95</w:t>
+              <w:t>#111</w:t>
             </w:r>
           </w:p>
         </w:tc>
@@ -3642,9 +2085,7 @@
           </w:tcPr>
           <w:p>
             <w:r>
-              <w:t>Umarpura + Chahian</w:t>
-              <w:br/>
-              <w:t>(ਉਮਰਪੁਰਾ + ਚਾਹੀਆਂ)</w:t>
+              <w:t>Manawala</w:t>
             </w:r>
           </w:p>
         </w:tc>
@@ -3654,7 +2095,7 @@
           </w:tcPr>
           <w:p>
             <w:r>
-              <w:t>110</w:t>
+              <w:t>62</w:t>
             </w:r>
           </w:p>
         </w:tc>
@@ -3664,7 +2105,7 @@
           </w:tcPr>
           <w:p>
             <w:r>
-              <w:t>-23.73%</w:t>
+              <w:t>9.47%</w:t>
             </w:r>
           </w:p>
         </w:tc>
@@ -3674,7 +2115,7 @@
           </w:tcPr>
           <w:p>
             <w:r>
-              <w:t>INC Won</w:t>
+              <w:t>SAD</w:t>
             </w:r>
           </w:p>
         </w:tc>
@@ -3684,7 +2125,7 @@
           </w:tcPr>
           <w:p>
             <w:r>
-              <w:t>-154 deficit</w:t>
+              <w:t>-112 deficit</w:t>
             </w:r>
           </w:p>
         </w:tc>
@@ -3696,7 +2137,7 @@
           </w:tcPr>
           <w:p>
             <w:r>
-              <w:t>#202</w:t>
+              <w:t>#61</w:t>
             </w:r>
           </w:p>
         </w:tc>
@@ -3706,9 +2147,7 @@
           </w:tcPr>
           <w:p>
             <w:r>
-              <w:t>Ward No. 1 Muhalla Gandhi Nagar + Ward No. 1 Muhalla Gandhi Nagar + Ward No. 1 Muhalla Gandhi Nagar + Ward No. 1 Muhalla Gandhi Nagar</w:t>
-              <w:br/>
-              <w:t>(ਵਾਰਡ ਨੰ. 1 ਮੁਹੱਲਾ ਗਾਂਧੀ ਨਗਰ + ਵਾਰਡ ਨੰ.1 ਮੁਹੱਲਾ ਗਾਂਧੀ ਨਗਰ + ਵਾਰਡ ਨੰ.1 ਮੁਹੱਲਾ ਗਾਂਧੀ ਨਗਰ + ਵਾਰਡ ਨੰ.1 ਮੁਹੱਲਾ ਗਾਂਧੀ ਨਗਰ)</w:t>
+              <w:t>Lepoke</w:t>
             </w:r>
           </w:p>
         </w:tc>
@@ -3718,7 +2157,7 @@
           </w:tcPr>
           <w:p>
             <w:r>
-              <w:t>98</w:t>
+              <w:t>51</w:t>
             </w:r>
           </w:p>
         </w:tc>
@@ -3728,7 +2167,7 @@
           </w:tcPr>
           <w:p>
             <w:r>
-              <w:t>-22.2%</w:t>
+              <w:t>9.6%</w:t>
             </w:r>
           </w:p>
         </w:tc>
@@ -3738,7 +2177,7 @@
           </w:tcPr>
           <w:p>
             <w:r>
-              <w:t>SAD Won</w:t>
+              <w:t>SAD</w:t>
             </w:r>
           </w:p>
         </w:tc>
@@ -3748,7 +2187,7 @@
           </w:tcPr>
           <w:p>
             <w:r>
-              <w:t>-36 deficit</w:t>
+              <w:t>-89 deficit</w:t>
             </w:r>
           </w:p>
         </w:tc>
@@ -3760,7 +2199,7 @@
           </w:tcPr>
           <w:p>
             <w:r>
-              <w:t>#9</w:t>
+              <w:t>#60</w:t>
             </w:r>
           </w:p>
         </w:tc>
@@ -3770,9 +2209,7 @@
           </w:tcPr>
           <w:p>
             <w:r>
-              <w:t>Bhindi Aulakh Kalan</w:t>
-              <w:br/>
-              <w:t>(ਭਿੰਡੀ ਅੌਲਖ ਕਲਾਂ)</w:t>
+              <w:t>Kande</w:t>
             </w:r>
           </w:p>
         </w:tc>
@@ -3782,7 +2219,7 @@
           </w:tcPr>
           <w:p>
             <w:r>
-              <w:t>77</w:t>
+              <w:t>52</w:t>
             </w:r>
           </w:p>
         </w:tc>
@@ -3792,7 +2229,7 @@
           </w:tcPr>
           <w:p>
             <w:r>
-              <w:t>-22.12%</w:t>
+              <w:t>9.89%</w:t>
             </w:r>
           </w:p>
         </w:tc>
@@ -3802,7 +2239,7 @@
           </w:tcPr>
           <w:p>
             <w:r>
-              <w:t>INC Won</w:t>
+              <w:t>SAD</w:t>
             </w:r>
           </w:p>
         </w:tc>
@@ -3812,7 +2249,7 @@
           </w:tcPr>
           <w:p>
             <w:r>
-              <w:t>-48 deficit</w:t>
+              <w:t>-142 deficit</w:t>
             </w:r>
           </w:p>
         </w:tc>
@@ -3824,7 +2261,7 @@
           </w:tcPr>
           <w:p>
             <w:r>
-              <w:t>#218</w:t>
+              <w:t>#155</w:t>
             </w:r>
           </w:p>
         </w:tc>
@@ -3834,9 +2271,7 @@
           </w:tcPr>
           <w:p>
             <w:r>
-              <w:t>Muglani Kot</w:t>
-              <w:br/>
-              <w:t>(ਮੁਗਲਾਣੀ ਕੋਟ)</w:t>
+              <w:t>Boparai Khurd</w:t>
             </w:r>
           </w:p>
         </w:tc>
@@ -3846,7 +2281,7 @@
           </w:tcPr>
           <w:p>
             <w:r>
-              <w:t>153</w:t>
+              <w:t>69</w:t>
             </w:r>
           </w:p>
         </w:tc>
@@ -3856,7 +2291,7 @@
           </w:tcPr>
           <w:p>
             <w:r>
-              <w:t>-22.01%</w:t>
+              <w:t>10.19%</w:t>
             </w:r>
           </w:p>
         </w:tc>
@@ -3866,7 +2301,7 @@
           </w:tcPr>
           <w:p>
             <w:r>
-              <w:t>INC Won</w:t>
+              <w:t>INC</w:t>
             </w:r>
           </w:p>
         </w:tc>
@@ -3876,327 +2311,7 @@
           </w:tcPr>
           <w:p>
             <w:r>
-              <w:t>-15 deficit</w:t>
-            </w:r>
-          </w:p>
-        </w:tc>
-      </w:tr>
-      <w:tr>
-        <w:tc>
-          <w:tcPr>
-            <w:tcW w:type="dxa" w:w="1680"/>
-          </w:tcPr>
-          <w:p>
-            <w:r>
-              <w:t>#203</w:t>
-            </w:r>
-          </w:p>
-        </w:tc>
-        <w:tc>
-          <w:tcPr>
-            <w:tcW w:type="dxa" w:w="1680"/>
-          </w:tcPr>
-          <w:p>
-            <w:r>
-              <w:t>Ward No. 12 Rajasansi Muhalla Gandhi Nagar + Ward No. 12 Muhalla Gandhi Nagar</w:t>
-              <w:br/>
-              <w:t>(ਵਾਰਡ ਨੰ.12 ਰਾਜਾਸਾਂਸੀ ਮੁਹੱਲਾ ਗਾਂਧੀ ਨਗਰ + ਵਾਰਡ ਨੰ.12 ਮੁਹੱਲਾ ਗਾਂਧੀ ਨਗਰ)</w:t>
-            </w:r>
-          </w:p>
-        </w:tc>
-        <w:tc>
-          <w:tcPr>
-            <w:tcW w:type="dxa" w:w="1680"/>
-          </w:tcPr>
-          <w:p>
-            <w:r>
-              <w:t>112</w:t>
-            </w:r>
-          </w:p>
-        </w:tc>
-        <w:tc>
-          <w:tcPr>
-            <w:tcW w:type="dxa" w:w="1680"/>
-          </w:tcPr>
-          <w:p>
-            <w:r>
-              <w:t>-21.51%</w:t>
-            </w:r>
-          </w:p>
-        </w:tc>
-        <w:tc>
-          <w:tcPr>
-            <w:tcW w:type="dxa" w:w="1680"/>
-          </w:tcPr>
-          <w:p>
-            <w:r>
-              <w:t>SAD Won</w:t>
-            </w:r>
-          </w:p>
-        </w:tc>
-        <w:tc>
-          <w:tcPr>
-            <w:tcW w:type="dxa" w:w="1680"/>
-          </w:tcPr>
-          <w:p>
-            <w:r>
-              <w:t>-23 deficit</w:t>
-            </w:r>
-          </w:p>
-        </w:tc>
-      </w:tr>
-      <w:tr>
-        <w:tc>
-          <w:tcPr>
-            <w:tcW w:type="dxa" w:w="1680"/>
-          </w:tcPr>
-          <w:p>
-            <w:r>
-              <w:t>#132</w:t>
-            </w:r>
-          </w:p>
-        </w:tc>
-        <w:tc>
-          <w:tcPr>
-            <w:tcW w:type="dxa" w:w="1680"/>
-          </w:tcPr>
-          <w:p>
-            <w:r>
-              <w:t>Dala</w:t>
-              <w:br/>
-              <w:t>(ਡਾਲਾ)</w:t>
-            </w:r>
-          </w:p>
-        </w:tc>
-        <w:tc>
-          <w:tcPr>
-            <w:tcW w:type="dxa" w:w="1680"/>
-          </w:tcPr>
-          <w:p>
-            <w:r>
-              <w:t>84</w:t>
-            </w:r>
-          </w:p>
-        </w:tc>
-        <w:tc>
-          <w:tcPr>
-            <w:tcW w:type="dxa" w:w="1680"/>
-          </w:tcPr>
-          <w:p>
-            <w:r>
-              <w:t>-20.87%</w:t>
-            </w:r>
-          </w:p>
-        </w:tc>
-        <w:tc>
-          <w:tcPr>
-            <w:tcW w:type="dxa" w:w="1680"/>
-          </w:tcPr>
-          <w:p>
-            <w:r>
-              <w:t>BJP Won</w:t>
-            </w:r>
-          </w:p>
-        </w:tc>
-        <w:tc>
-          <w:tcPr>
-            <w:tcW w:type="dxa" w:w="1680"/>
-          </w:tcPr>
-          <w:p>
-            <w:r>
-              <w:t>-85 deficit</w:t>
-            </w:r>
-          </w:p>
-        </w:tc>
-      </w:tr>
-      <w:tr>
-        <w:tc>
-          <w:tcPr>
-            <w:tcW w:type="dxa" w:w="1680"/>
-          </w:tcPr>
-          <w:p>
-            <w:r>
-              <w:t>#123</w:t>
-            </w:r>
-          </w:p>
-        </w:tc>
-        <w:tc>
-          <w:tcPr>
-            <w:tcW w:type="dxa" w:w="1680"/>
-          </w:tcPr>
-          <w:p>
-            <w:r>
-              <w:t>Thathi</w:t>
-              <w:br/>
-              <w:t>(ਠੱਠੀ)</w:t>
-            </w:r>
-          </w:p>
-        </w:tc>
-        <w:tc>
-          <w:tcPr>
-            <w:tcW w:type="dxa" w:w="1680"/>
-          </w:tcPr>
-          <w:p>
-            <w:r>
-              <w:t>148</w:t>
-            </w:r>
-          </w:p>
-        </w:tc>
-        <w:tc>
-          <w:tcPr>
-            <w:tcW w:type="dxa" w:w="1680"/>
-          </w:tcPr>
-          <w:p>
-            <w:r>
-              <w:t>-18.75%</w:t>
-            </w:r>
-          </w:p>
-        </w:tc>
-        <w:tc>
-          <w:tcPr>
-            <w:tcW w:type="dxa" w:w="1680"/>
-          </w:tcPr>
-          <w:p>
-            <w:r>
-              <w:t>INC Won</w:t>
-            </w:r>
-          </w:p>
-        </w:tc>
-        <w:tc>
-          <w:tcPr>
-            <w:tcW w:type="dxa" w:w="1680"/>
-          </w:tcPr>
-          <w:p>
-            <w:r>
-              <w:t>-18 deficit</w:t>
-            </w:r>
-          </w:p>
-        </w:tc>
-      </w:tr>
-      <w:tr>
-        <w:tc>
-          <w:tcPr>
-            <w:tcW w:type="dxa" w:w="1680"/>
-          </w:tcPr>
-          <w:p>
-            <w:r>
-              <w:t>#201</w:t>
-            </w:r>
-          </w:p>
-        </w:tc>
-        <w:tc>
-          <w:tcPr>
-            <w:tcW w:type="dxa" w:w="1680"/>
-          </w:tcPr>
-          <w:p>
-            <w:r>
-              <w:t>Radala</w:t>
-              <w:br/>
-              <w:t>(ਰਡਾਲਾ)</w:t>
-            </w:r>
-          </w:p>
-        </w:tc>
-        <w:tc>
-          <w:tcPr>
-            <w:tcW w:type="dxa" w:w="1680"/>
-          </w:tcPr>
-          <w:p>
-            <w:r>
-              <w:t>120</w:t>
-            </w:r>
-          </w:p>
-        </w:tc>
-        <w:tc>
-          <w:tcPr>
-            <w:tcW w:type="dxa" w:w="1680"/>
-          </w:tcPr>
-          <w:p>
-            <w:r>
-              <w:t>-18.38%</w:t>
-            </w:r>
-          </w:p>
-        </w:tc>
-        <w:tc>
-          <w:tcPr>
-            <w:tcW w:type="dxa" w:w="1680"/>
-          </w:tcPr>
-          <w:p>
-            <w:r>
-              <w:t>BJP Won</w:t>
-            </w:r>
-          </w:p>
-        </w:tc>
-        <w:tc>
-          <w:tcPr>
-            <w:tcW w:type="dxa" w:w="1680"/>
-          </w:tcPr>
-          <w:p>
-            <w:r>
-              <w:t>-43 deficit</w:t>
-            </w:r>
-          </w:p>
-        </w:tc>
-      </w:tr>
-      <w:tr>
-        <w:tc>
-          <w:tcPr>
-            <w:tcW w:type="dxa" w:w="1680"/>
-          </w:tcPr>
-          <w:p>
-            <w:r>
-              <w:t>#133</w:t>
-            </w:r>
-          </w:p>
-        </w:tc>
-        <w:tc>
-          <w:tcPr>
-            <w:tcW w:type="dxa" w:w="1680"/>
-          </w:tcPr>
-          <w:p>
-            <w:r>
-              <w:t>Kirlgarh</w:t>
-              <w:br/>
-              <w:t>(ਕਿਰਲਗੜ)</w:t>
-            </w:r>
-          </w:p>
-        </w:tc>
-        <w:tc>
-          <w:tcPr>
-            <w:tcW w:type="dxa" w:w="1680"/>
-          </w:tcPr>
-          <w:p>
-            <w:r>
-              <w:t>144</w:t>
-            </w:r>
-          </w:p>
-        </w:tc>
-        <w:tc>
-          <w:tcPr>
-            <w:tcW w:type="dxa" w:w="1680"/>
-          </w:tcPr>
-          <w:p>
-            <w:r>
-              <w:t>-18.19%</w:t>
-            </w:r>
-          </w:p>
-        </w:tc>
-        <w:tc>
-          <w:tcPr>
-            <w:tcW w:type="dxa" w:w="1680"/>
-          </w:tcPr>
-          <w:p>
-            <w:r>
-              <w:t>INC Won</w:t>
-            </w:r>
-          </w:p>
-        </w:tc>
-        <w:tc>
-          <w:tcPr>
-            <w:tcW w:type="dxa" w:w="1680"/>
-          </w:tcPr>
-          <w:p>
-            <w:r>
-              <w:t>-156 deficit</w:t>
+              <w:t>-53 deficit</w:t>
             </w:r>
           </w:p>
         </w:tc>
@@ -4206,62 +2321,6 @@
       <w:pPr>
         <w:spacing w:after="240"/>
       </w:pPr>
-    </w:p>
-    <w:p>
-      <w:pPr>
-        <w:pStyle w:val="Heading1"/>
-      </w:pPr>
-      <w:r>
-        <w:t>6. Field Operations &amp; Strategic Action Directives</w:t>
-      </w:r>
-    </w:p>
-    <w:p>
-      <w:r>
-        <w:rPr>
-          <w:b/>
-          <w:color w:val="002B49"/>
-        </w:rPr>
-        <w:t xml:space="preserve">1. Immediate Cadre Audit in 35 Lost Booths: </w:t>
-      </w:r>
-      <w:r>
-        <w:t>Convene booth committee meetings in the 35 booths conceded to INC and BJP. Audit localized governance dissatisfaction, beneficiary delivery bottlenecks, and intra-party factionalism.</w:t>
-      </w:r>
-    </w:p>
-    <w:p>
-      <w:r>
-        <w:rPr>
-          <w:b/>
-          <w:color w:val="002B49"/>
-        </w:rPr>
-        <w:t xml:space="preserve">2. Consolidate the 46 Flipped Expansion Booths: </w:t>
-      </w:r>
-      <w:r>
-        <w:t>The 46 newly conquered booths represent Akali voters shifting toward AAP. Deepen ties with village elders (panchayats), youth sports clubs, and cooperative society leaders to institutionalize this shift.</w:t>
-      </w:r>
-    </w:p>
-    <w:p>
-      <w:r>
-        <w:rPr>
-          <w:b/>
-          <w:color w:val="002B49"/>
-        </w:rPr>
-        <w:t xml:space="preserve">3. Counter Urban BJP Inroads: </w:t>
-      </w:r>
-      <w:r>
-        <w:t>BJP secured 11 booths and reached 10.26% share. Establish dedicated town and semi-urban merchant outreach cells in commercial clusters around Raja Sansi town and airport periphery.</w:t>
-      </w:r>
-    </w:p>
-    <w:p>
-      <w:r>
-        <w:rPr>
-          <w:b/>
-          <w:color w:val="002B49"/>
-        </w:rPr>
-        <w:t xml:space="preserve">4. Targeted Turnout Revival Program: </w:t>
-      </w:r>
-      <w:r>
-        <w:t>Because 19,426 voters stayed home in 2024, identify voter registries with low turnout (&lt;50%) and organize registration and voter-turnout mobilization drives ahead of 2027.</w:t>
-      </w:r>
     </w:p>
     <w:sectPr>
       <w:headerReference w:type="default" r:id="rId9"/>

</xml_diff>